<commit_message>
Rebuild the book with the rank-9 ETF rule
Chapter 13 numbers, charts and settings text now follow the new ETF exit rank. The Word
file was rebuilt from scratch with an updated table of contents.

Co-Authored-By: Claude Opus 5.5 <noreply@anthropic.com>
</commit_message>
<xml_diff>
--- a/book/Momentum_Investing_Book.docx
+++ b/book/Momentum_Investing_Book.docx
@@ -163,7 +163,7 @@
     <w:sdt>
       <w:sdtPr>
         <w:alias w:val="Contents"/>
-        <w:id w:val="-1893642381"/>
+        <w:id w:val="817687810"/>
       </w:sdtPr>
       <w:sdtEndPr/>
       <w:sdtContent>
@@ -192,7 +192,7 @@
           <w:r>
             <w:fldChar w:fldCharType="separate"/>
           </w:r>
-          <w:hyperlink w:anchor="_Toc241269474" w:history="1">
+          <w:hyperlink w:anchor="_Toc241270401" w:history="1">
             <w:r>
               <w:rPr>
                 <w:rStyle w:val="Hyperlink"/>
@@ -216,7 +216,7 @@
               <w:rPr>
                 <w:noProof/>
               </w:rPr>
-              <w:instrText xml:space="preserve"> PAGEREF _Toc241269474 \h </w:instrText>
+              <w:instrText xml:space="preserve"> PAGEREF _Toc241270401 \h </w:instrText>
             </w:r>
             <w:r>
               <w:rPr>
@@ -259,7 +259,7 @@
               <w14:ligatures w14:val="standardContextual"/>
             </w:rPr>
           </w:pPr>
-          <w:hyperlink w:anchor="_Toc241269475" w:history="1">
+          <w:hyperlink w:anchor="_Toc241270402" w:history="1">
             <w:r>
               <w:rPr>
                 <w:rStyle w:val="Hyperlink"/>
@@ -283,7 +283,7 @@
               <w:rPr>
                 <w:noProof/>
               </w:rPr>
-              <w:instrText xml:space="preserve"> PAGEREF _Toc241269475 \h </w:instrText>
+              <w:instrText xml:space="preserve"> PAGEREF _Toc241270402 \h </w:instrText>
             </w:r>
             <w:r>
               <w:rPr>
@@ -326,7 +326,7 @@
               <w14:ligatures w14:val="standardContextual"/>
             </w:rPr>
           </w:pPr>
-          <w:hyperlink w:anchor="_Toc241269476" w:history="1">
+          <w:hyperlink w:anchor="_Toc241270403" w:history="1">
             <w:r>
               <w:rPr>
                 <w:rStyle w:val="Hyperlink"/>
@@ -350,7 +350,7 @@
               <w:rPr>
                 <w:noProof/>
               </w:rPr>
-              <w:instrText xml:space="preserve"> PAGEREF _Toc241269476 \h </w:instrText>
+              <w:instrText xml:space="preserve"> PAGEREF _Toc241270403 \h </w:instrText>
             </w:r>
             <w:r>
               <w:rPr>
@@ -393,7 +393,7 @@
               <w14:ligatures w14:val="standardContextual"/>
             </w:rPr>
           </w:pPr>
-          <w:hyperlink w:anchor="_Toc241269477" w:history="1">
+          <w:hyperlink w:anchor="_Toc241270404" w:history="1">
             <w:r>
               <w:rPr>
                 <w:rStyle w:val="Hyperlink"/>
@@ -417,7 +417,7 @@
               <w:rPr>
                 <w:noProof/>
               </w:rPr>
-              <w:instrText xml:space="preserve"> PAGEREF _Toc241269477 \h </w:instrText>
+              <w:instrText xml:space="preserve"> PAGEREF _Toc241270404 \h </w:instrText>
             </w:r>
             <w:r>
               <w:rPr>
@@ -460,7 +460,7 @@
               <w14:ligatures w14:val="standardContextual"/>
             </w:rPr>
           </w:pPr>
-          <w:hyperlink w:anchor="_Toc241269478" w:history="1">
+          <w:hyperlink w:anchor="_Toc241270405" w:history="1">
             <w:r>
               <w:rPr>
                 <w:rStyle w:val="Hyperlink"/>
@@ -484,7 +484,7 @@
               <w:rPr>
                 <w:noProof/>
               </w:rPr>
-              <w:instrText xml:space="preserve"> PAGEREF _Toc241269478 \h </w:instrText>
+              <w:instrText xml:space="preserve"> PAGEREF _Toc241270405 \h </w:instrText>
             </w:r>
             <w:r>
               <w:rPr>
@@ -527,7 +527,7 @@
               <w14:ligatures w14:val="standardContextual"/>
             </w:rPr>
           </w:pPr>
-          <w:hyperlink w:anchor="_Toc241269479" w:history="1">
+          <w:hyperlink w:anchor="_Toc241270406" w:history="1">
             <w:r>
               <w:rPr>
                 <w:rStyle w:val="Hyperlink"/>
@@ -551,7 +551,7 @@
               <w:rPr>
                 <w:noProof/>
               </w:rPr>
-              <w:instrText xml:space="preserve"> PAGEREF _Toc241269479 \h </w:instrText>
+              <w:instrText xml:space="preserve"> PAGEREF _Toc241270406 \h </w:instrText>
             </w:r>
             <w:r>
               <w:rPr>
@@ -594,7 +594,7 @@
               <w14:ligatures w14:val="standardContextual"/>
             </w:rPr>
           </w:pPr>
-          <w:hyperlink w:anchor="_Toc241269480" w:history="1">
+          <w:hyperlink w:anchor="_Toc241270407" w:history="1">
             <w:r>
               <w:rPr>
                 <w:rStyle w:val="Hyperlink"/>
@@ -618,7 +618,7 @@
               <w:rPr>
                 <w:noProof/>
               </w:rPr>
-              <w:instrText xml:space="preserve"> PAGEREF _Toc241269480 \h </w:instrText>
+              <w:instrText xml:space="preserve"> PAGEREF _Toc241270407 \h </w:instrText>
             </w:r>
             <w:r>
               <w:rPr>
@@ -661,7 +661,7 @@
               <w14:ligatures w14:val="standardContextual"/>
             </w:rPr>
           </w:pPr>
-          <w:hyperlink w:anchor="_Toc241269481" w:history="1">
+          <w:hyperlink w:anchor="_Toc241270408" w:history="1">
             <w:r>
               <w:rPr>
                 <w:rStyle w:val="Hyperlink"/>
@@ -685,7 +685,7 @@
               <w:rPr>
                 <w:noProof/>
               </w:rPr>
-              <w:instrText xml:space="preserve"> PAGEREF _Toc241269481 \h </w:instrText>
+              <w:instrText xml:space="preserve"> PAGEREF _Toc241270408 \h </w:instrText>
             </w:r>
             <w:r>
               <w:rPr>
@@ -728,7 +728,7 @@
               <w14:ligatures w14:val="standardContextual"/>
             </w:rPr>
           </w:pPr>
-          <w:hyperlink w:anchor="_Toc241269482" w:history="1">
+          <w:hyperlink w:anchor="_Toc241270409" w:history="1">
             <w:r>
               <w:rPr>
                 <w:rStyle w:val="Hyperlink"/>
@@ -752,7 +752,7 @@
               <w:rPr>
                 <w:noProof/>
               </w:rPr>
-              <w:instrText xml:space="preserve"> PAGEREF _Toc241269482 \h </w:instrText>
+              <w:instrText xml:space="preserve"> PAGEREF _Toc241270409 \h </w:instrText>
             </w:r>
             <w:r>
               <w:rPr>
@@ -795,7 +795,7 @@
               <w14:ligatures w14:val="standardContextual"/>
             </w:rPr>
           </w:pPr>
-          <w:hyperlink w:anchor="_Toc241269483" w:history="1">
+          <w:hyperlink w:anchor="_Toc241270410" w:history="1">
             <w:r>
               <w:rPr>
                 <w:rStyle w:val="Hyperlink"/>
@@ -819,7 +819,7 @@
               <w:rPr>
                 <w:noProof/>
               </w:rPr>
-              <w:instrText xml:space="preserve"> PAGEREF _Toc241269483 \h </w:instrText>
+              <w:instrText xml:space="preserve"> PAGEREF _Toc241270410 \h </w:instrText>
             </w:r>
             <w:r>
               <w:rPr>
@@ -862,7 +862,7 @@
               <w14:ligatures w14:val="standardContextual"/>
             </w:rPr>
           </w:pPr>
-          <w:hyperlink w:anchor="_Toc241269484" w:history="1">
+          <w:hyperlink w:anchor="_Toc241270411" w:history="1">
             <w:r>
               <w:rPr>
                 <w:rStyle w:val="Hyperlink"/>
@@ -886,7 +886,7 @@
               <w:rPr>
                 <w:noProof/>
               </w:rPr>
-              <w:instrText xml:space="preserve"> PAGEREF _Toc241269484 \h </w:instrText>
+              <w:instrText xml:space="preserve"> PAGEREF _Toc241270411 \h </w:instrText>
             </w:r>
             <w:r>
               <w:rPr>
@@ -929,7 +929,7 @@
               <w14:ligatures w14:val="standardContextual"/>
             </w:rPr>
           </w:pPr>
-          <w:hyperlink w:anchor="_Toc241269485" w:history="1">
+          <w:hyperlink w:anchor="_Toc241270412" w:history="1">
             <w:r>
               <w:rPr>
                 <w:rStyle w:val="Hyperlink"/>
@@ -953,7 +953,7 @@
               <w:rPr>
                 <w:noProof/>
               </w:rPr>
-              <w:instrText xml:space="preserve"> PAGEREF _Toc241269485 \h </w:instrText>
+              <w:instrText xml:space="preserve"> PAGEREF _Toc241270412 \h </w:instrText>
             </w:r>
             <w:r>
               <w:rPr>
@@ -996,7 +996,7 @@
               <w14:ligatures w14:val="standardContextual"/>
             </w:rPr>
           </w:pPr>
-          <w:hyperlink w:anchor="_Toc241269486" w:history="1">
+          <w:hyperlink w:anchor="_Toc241270413" w:history="1">
             <w:r>
               <w:rPr>
                 <w:rStyle w:val="Hyperlink"/>
@@ -1020,7 +1020,7 @@
               <w:rPr>
                 <w:noProof/>
               </w:rPr>
-              <w:instrText xml:space="preserve"> PAGEREF _Toc241269486 \h </w:instrText>
+              <w:instrText xml:space="preserve"> PAGEREF _Toc241270413 \h </w:instrText>
             </w:r>
             <w:r>
               <w:rPr>
@@ -1063,7 +1063,7 @@
               <w14:ligatures w14:val="standardContextual"/>
             </w:rPr>
           </w:pPr>
-          <w:hyperlink w:anchor="_Toc241269487" w:history="1">
+          <w:hyperlink w:anchor="_Toc241270414" w:history="1">
             <w:r>
               <w:rPr>
                 <w:rStyle w:val="Hyperlink"/>
@@ -1087,7 +1087,7 @@
               <w:rPr>
                 <w:noProof/>
               </w:rPr>
-              <w:instrText xml:space="preserve"> PAGEREF _Toc241269487 \h </w:instrText>
+              <w:instrText xml:space="preserve"> PAGEREF _Toc241270414 \h </w:instrText>
             </w:r>
             <w:r>
               <w:rPr>
@@ -1130,7 +1130,7 @@
               <w14:ligatures w14:val="standardContextual"/>
             </w:rPr>
           </w:pPr>
-          <w:hyperlink w:anchor="_Toc241269488" w:history="1">
+          <w:hyperlink w:anchor="_Toc241270415" w:history="1">
             <w:r>
               <w:rPr>
                 <w:rStyle w:val="Hyperlink"/>
@@ -1154,7 +1154,7 @@
               <w:rPr>
                 <w:noProof/>
               </w:rPr>
-              <w:instrText xml:space="preserve"> PAGEREF _Toc241269488 \h </w:instrText>
+              <w:instrText xml:space="preserve"> PAGEREF _Toc241270415 \h </w:instrText>
             </w:r>
             <w:r>
               <w:rPr>
@@ -1197,7 +1197,7 @@
               <w14:ligatures w14:val="standardContextual"/>
             </w:rPr>
           </w:pPr>
-          <w:hyperlink w:anchor="_Toc241269489" w:history="1">
+          <w:hyperlink w:anchor="_Toc241270416" w:history="1">
             <w:r>
               <w:rPr>
                 <w:rStyle w:val="Hyperlink"/>
@@ -1221,7 +1221,7 @@
               <w:rPr>
                 <w:noProof/>
               </w:rPr>
-              <w:instrText xml:space="preserve"> PAGEREF _Toc241269489 \h </w:instrText>
+              <w:instrText xml:space="preserve"> PAGEREF _Toc241270416 \h </w:instrText>
             </w:r>
             <w:r>
               <w:rPr>
@@ -1264,7 +1264,7 @@
               <w14:ligatures w14:val="standardContextual"/>
             </w:rPr>
           </w:pPr>
-          <w:hyperlink w:anchor="_Toc241269490" w:history="1">
+          <w:hyperlink w:anchor="_Toc241270417" w:history="1">
             <w:r>
               <w:rPr>
                 <w:rStyle w:val="Hyperlink"/>
@@ -1288,7 +1288,7 @@
               <w:rPr>
                 <w:noProof/>
               </w:rPr>
-              <w:instrText xml:space="preserve"> PAGEREF _Toc241269490 \h </w:instrText>
+              <w:instrText xml:space="preserve"> PAGEREF _Toc241270417 \h </w:instrText>
             </w:r>
             <w:r>
               <w:rPr>
@@ -1331,7 +1331,7 @@
               <w14:ligatures w14:val="standardContextual"/>
             </w:rPr>
           </w:pPr>
-          <w:hyperlink w:anchor="_Toc241269491" w:history="1">
+          <w:hyperlink w:anchor="_Toc241270418" w:history="1">
             <w:r>
               <w:rPr>
                 <w:rStyle w:val="Hyperlink"/>
@@ -1355,7 +1355,7 @@
               <w:rPr>
                 <w:noProof/>
               </w:rPr>
-              <w:instrText xml:space="preserve"> PAGEREF _Toc241269491 \h </w:instrText>
+              <w:instrText xml:space="preserve"> PAGEREF _Toc241270418 \h </w:instrText>
             </w:r>
             <w:r>
               <w:rPr>
@@ -1398,7 +1398,7 @@
               <w14:ligatures w14:val="standardContextual"/>
             </w:rPr>
           </w:pPr>
-          <w:hyperlink w:anchor="_Toc241269492" w:history="1">
+          <w:hyperlink w:anchor="_Toc241270419" w:history="1">
             <w:r>
               <w:rPr>
                 <w:rStyle w:val="Hyperlink"/>
@@ -1422,7 +1422,7 @@
               <w:rPr>
                 <w:noProof/>
               </w:rPr>
-              <w:instrText xml:space="preserve"> PAGEREF _Toc241269492 \h </w:instrText>
+              <w:instrText xml:space="preserve"> PAGEREF _Toc241270419 \h </w:instrText>
             </w:r>
             <w:r>
               <w:rPr>
@@ -1465,7 +1465,7 @@
               <w14:ligatures w14:val="standardContextual"/>
             </w:rPr>
           </w:pPr>
-          <w:hyperlink w:anchor="_Toc241269493" w:history="1">
+          <w:hyperlink w:anchor="_Toc241270420" w:history="1">
             <w:r>
               <w:rPr>
                 <w:rStyle w:val="Hyperlink"/>
@@ -1489,7 +1489,7 @@
               <w:rPr>
                 <w:noProof/>
               </w:rPr>
-              <w:instrText xml:space="preserve"> PAGEREF _Toc241269493 \h </w:instrText>
+              <w:instrText xml:space="preserve"> PAGEREF _Toc241270420 \h </w:instrText>
             </w:r>
             <w:r>
               <w:rPr>
@@ -1532,7 +1532,7 @@
               <w14:ligatures w14:val="standardContextual"/>
             </w:rPr>
           </w:pPr>
-          <w:hyperlink w:anchor="_Toc241269494" w:history="1">
+          <w:hyperlink w:anchor="_Toc241270421" w:history="1">
             <w:r>
               <w:rPr>
                 <w:rStyle w:val="Hyperlink"/>
@@ -1556,7 +1556,7 @@
               <w:rPr>
                 <w:noProof/>
               </w:rPr>
-              <w:instrText xml:space="preserve"> PAGEREF _Toc241269494 \h </w:instrText>
+              <w:instrText xml:space="preserve"> PAGEREF _Toc241270421 \h </w:instrText>
             </w:r>
             <w:r>
               <w:rPr>
@@ -1599,7 +1599,7 @@
               <w14:ligatures w14:val="standardContextual"/>
             </w:rPr>
           </w:pPr>
-          <w:hyperlink w:anchor="_Toc241269495" w:history="1">
+          <w:hyperlink w:anchor="_Toc241270422" w:history="1">
             <w:r>
               <w:rPr>
                 <w:rStyle w:val="Hyperlink"/>
@@ -1623,7 +1623,7 @@
               <w:rPr>
                 <w:noProof/>
               </w:rPr>
-              <w:instrText xml:space="preserve"> PAGEREF _Toc241269495 \h </w:instrText>
+              <w:instrText xml:space="preserve"> PAGEREF _Toc241270422 \h </w:instrText>
             </w:r>
             <w:r>
               <w:rPr>
@@ -1666,7 +1666,7 @@
               <w14:ligatures w14:val="standardContextual"/>
             </w:rPr>
           </w:pPr>
-          <w:hyperlink w:anchor="_Toc241269496" w:history="1">
+          <w:hyperlink w:anchor="_Toc241270423" w:history="1">
             <w:r>
               <w:rPr>
                 <w:rStyle w:val="Hyperlink"/>
@@ -1690,7 +1690,7 @@
               <w:rPr>
                 <w:noProof/>
               </w:rPr>
-              <w:instrText xml:space="preserve"> PAGEREF _Toc241269496 \h </w:instrText>
+              <w:instrText xml:space="preserve"> PAGEREF _Toc241270423 \h </w:instrText>
             </w:r>
             <w:r>
               <w:rPr>
@@ -1733,7 +1733,7 @@
               <w14:ligatures w14:val="standardContextual"/>
             </w:rPr>
           </w:pPr>
-          <w:hyperlink w:anchor="_Toc241269497" w:history="1">
+          <w:hyperlink w:anchor="_Toc241270424" w:history="1">
             <w:r>
               <w:rPr>
                 <w:rStyle w:val="Hyperlink"/>
@@ -1757,7 +1757,7 @@
               <w:rPr>
                 <w:noProof/>
               </w:rPr>
-              <w:instrText xml:space="preserve"> PAGEREF _Toc241269497 \h </w:instrText>
+              <w:instrText xml:space="preserve"> PAGEREF _Toc241270424 \h </w:instrText>
             </w:r>
             <w:r>
               <w:rPr>
@@ -1800,7 +1800,7 @@
               <w14:ligatures w14:val="standardContextual"/>
             </w:rPr>
           </w:pPr>
-          <w:hyperlink w:anchor="_Toc241269498" w:history="1">
+          <w:hyperlink w:anchor="_Toc241270425" w:history="1">
             <w:r>
               <w:rPr>
                 <w:rStyle w:val="Hyperlink"/>
@@ -1824,7 +1824,7 @@
               <w:rPr>
                 <w:noProof/>
               </w:rPr>
-              <w:instrText xml:space="preserve"> PAGEREF _Toc241269498 \h </w:instrText>
+              <w:instrText xml:space="preserve"> PAGEREF _Toc241270425 \h </w:instrText>
             </w:r>
             <w:r>
               <w:rPr>
@@ -1867,7 +1867,7 @@
               <w14:ligatures w14:val="standardContextual"/>
             </w:rPr>
           </w:pPr>
-          <w:hyperlink w:anchor="_Toc241269499" w:history="1">
+          <w:hyperlink w:anchor="_Toc241270426" w:history="1">
             <w:r>
               <w:rPr>
                 <w:rStyle w:val="Hyperlink"/>
@@ -1891,7 +1891,7 @@
               <w:rPr>
                 <w:noProof/>
               </w:rPr>
-              <w:instrText xml:space="preserve"> PAGEREF _Toc241269499 \h </w:instrText>
+              <w:instrText xml:space="preserve"> PAGEREF _Toc241270426 \h </w:instrText>
             </w:r>
             <w:r>
               <w:rPr>
@@ -1934,7 +1934,7 @@
               <w14:ligatures w14:val="standardContextual"/>
             </w:rPr>
           </w:pPr>
-          <w:hyperlink w:anchor="_Toc241269500" w:history="1">
+          <w:hyperlink w:anchor="_Toc241270427" w:history="1">
             <w:r>
               <w:rPr>
                 <w:rStyle w:val="Hyperlink"/>
@@ -1958,7 +1958,7 @@
               <w:rPr>
                 <w:noProof/>
               </w:rPr>
-              <w:instrText xml:space="preserve"> PAGEREF _Toc241269500 \h </w:instrText>
+              <w:instrText xml:space="preserve"> PAGEREF _Toc241270427 \h </w:instrText>
             </w:r>
             <w:r>
               <w:rPr>
@@ -2001,7 +2001,7 @@
               <w14:ligatures w14:val="standardContextual"/>
             </w:rPr>
           </w:pPr>
-          <w:hyperlink w:anchor="_Toc241269501" w:history="1">
+          <w:hyperlink w:anchor="_Toc241270428" w:history="1">
             <w:r>
               <w:rPr>
                 <w:rStyle w:val="Hyperlink"/>
@@ -2025,7 +2025,7 @@
               <w:rPr>
                 <w:noProof/>
               </w:rPr>
-              <w:instrText xml:space="preserve"> PAGEREF _Toc241269501 \h </w:instrText>
+              <w:instrText xml:space="preserve"> PAGEREF _Toc241270428 \h </w:instrText>
             </w:r>
             <w:r>
               <w:rPr>
@@ -2068,7 +2068,7 @@
               <w14:ligatures w14:val="standardContextual"/>
             </w:rPr>
           </w:pPr>
-          <w:hyperlink w:anchor="_Toc241269502" w:history="1">
+          <w:hyperlink w:anchor="_Toc241270429" w:history="1">
             <w:r>
               <w:rPr>
                 <w:rStyle w:val="Hyperlink"/>
@@ -2092,7 +2092,7 @@
               <w:rPr>
                 <w:noProof/>
               </w:rPr>
-              <w:instrText xml:space="preserve"> PAGEREF _Toc241269502 \h </w:instrText>
+              <w:instrText xml:space="preserve"> PAGEREF _Toc241270429 \h </w:instrText>
             </w:r>
             <w:r>
               <w:rPr>
@@ -2135,7 +2135,7 @@
               <w14:ligatures w14:val="standardContextual"/>
             </w:rPr>
           </w:pPr>
-          <w:hyperlink w:anchor="_Toc241269503" w:history="1">
+          <w:hyperlink w:anchor="_Toc241270430" w:history="1">
             <w:r>
               <w:rPr>
                 <w:rStyle w:val="Hyperlink"/>
@@ -2159,7 +2159,7 @@
               <w:rPr>
                 <w:noProof/>
               </w:rPr>
-              <w:instrText xml:space="preserve"> PAGEREF _Toc241269503 \h </w:instrText>
+              <w:instrText xml:space="preserve"> PAGEREF _Toc241270430 \h </w:instrText>
             </w:r>
             <w:r>
               <w:rPr>
@@ -2202,7 +2202,7 @@
               <w14:ligatures w14:val="standardContextual"/>
             </w:rPr>
           </w:pPr>
-          <w:hyperlink w:anchor="_Toc241269504" w:history="1">
+          <w:hyperlink w:anchor="_Toc241270431" w:history="1">
             <w:r>
               <w:rPr>
                 <w:rStyle w:val="Hyperlink"/>
@@ -2226,7 +2226,7 @@
               <w:rPr>
                 <w:noProof/>
               </w:rPr>
-              <w:instrText xml:space="preserve"> PAGEREF _Toc241269504 \h </w:instrText>
+              <w:instrText xml:space="preserve"> PAGEREF _Toc241270431 \h </w:instrText>
             </w:r>
             <w:r>
               <w:rPr>
@@ -2269,7 +2269,7 @@
               <w14:ligatures w14:val="standardContextual"/>
             </w:rPr>
           </w:pPr>
-          <w:hyperlink w:anchor="_Toc241269505" w:history="1">
+          <w:hyperlink w:anchor="_Toc241270432" w:history="1">
             <w:r>
               <w:rPr>
                 <w:rStyle w:val="Hyperlink"/>
@@ -2293,7 +2293,7 @@
               <w:rPr>
                 <w:noProof/>
               </w:rPr>
-              <w:instrText xml:space="preserve"> PAGEREF _Toc241269505 \h </w:instrText>
+              <w:instrText xml:space="preserve"> PAGEREF _Toc241270432 \h </w:instrText>
             </w:r>
             <w:r>
               <w:rPr>
@@ -2336,7 +2336,7 @@
               <w14:ligatures w14:val="standardContextual"/>
             </w:rPr>
           </w:pPr>
-          <w:hyperlink w:anchor="_Toc241269506" w:history="1">
+          <w:hyperlink w:anchor="_Toc241270433" w:history="1">
             <w:r>
               <w:rPr>
                 <w:rStyle w:val="Hyperlink"/>
@@ -2360,7 +2360,7 @@
               <w:rPr>
                 <w:noProof/>
               </w:rPr>
-              <w:instrText xml:space="preserve"> PAGEREF _Toc241269506 \h </w:instrText>
+              <w:instrText xml:space="preserve"> PAGEREF _Toc241270433 \h </w:instrText>
             </w:r>
             <w:r>
               <w:rPr>
@@ -2403,7 +2403,7 @@
               <w14:ligatures w14:val="standardContextual"/>
             </w:rPr>
           </w:pPr>
-          <w:hyperlink w:anchor="_Toc241269507" w:history="1">
+          <w:hyperlink w:anchor="_Toc241270434" w:history="1">
             <w:r>
               <w:rPr>
                 <w:rStyle w:val="Hyperlink"/>
@@ -2427,7 +2427,7 @@
               <w:rPr>
                 <w:noProof/>
               </w:rPr>
-              <w:instrText xml:space="preserve"> PAGEREF _Toc241269507 \h </w:instrText>
+              <w:instrText xml:space="preserve"> PAGEREF _Toc241270434 \h </w:instrText>
             </w:r>
             <w:r>
               <w:rPr>
@@ -2470,7 +2470,7 @@
               <w14:ligatures w14:val="standardContextual"/>
             </w:rPr>
           </w:pPr>
-          <w:hyperlink w:anchor="_Toc241269508" w:history="1">
+          <w:hyperlink w:anchor="_Toc241270435" w:history="1">
             <w:r>
               <w:rPr>
                 <w:rStyle w:val="Hyperlink"/>
@@ -2494,7 +2494,7 @@
               <w:rPr>
                 <w:noProof/>
               </w:rPr>
-              <w:instrText xml:space="preserve"> PAGEREF _Toc241269508 \h </w:instrText>
+              <w:instrText xml:space="preserve"> PAGEREF _Toc241270435 \h </w:instrText>
             </w:r>
             <w:r>
               <w:rPr>
@@ -2537,7 +2537,7 @@
               <w14:ligatures w14:val="standardContextual"/>
             </w:rPr>
           </w:pPr>
-          <w:hyperlink w:anchor="_Toc241269509" w:history="1">
+          <w:hyperlink w:anchor="_Toc241270436" w:history="1">
             <w:r>
               <w:rPr>
                 <w:rStyle w:val="Hyperlink"/>
@@ -2561,7 +2561,7 @@
               <w:rPr>
                 <w:noProof/>
               </w:rPr>
-              <w:instrText xml:space="preserve"> PAGEREF _Toc241269509 \h </w:instrText>
+              <w:instrText xml:space="preserve"> PAGEREF _Toc241270436 \h </w:instrText>
             </w:r>
             <w:r>
               <w:rPr>
@@ -2604,7 +2604,7 @@
               <w14:ligatures w14:val="standardContextual"/>
             </w:rPr>
           </w:pPr>
-          <w:hyperlink w:anchor="_Toc241269510" w:history="1">
+          <w:hyperlink w:anchor="_Toc241270437" w:history="1">
             <w:r>
               <w:rPr>
                 <w:rStyle w:val="Hyperlink"/>
@@ -2628,7 +2628,7 @@
               <w:rPr>
                 <w:noProof/>
               </w:rPr>
-              <w:instrText xml:space="preserve"> PAGEREF _Toc241269510 \h </w:instrText>
+              <w:instrText xml:space="preserve"> PAGEREF _Toc241270437 \h </w:instrText>
             </w:r>
             <w:r>
               <w:rPr>
@@ -2671,7 +2671,7 @@
               <w14:ligatures w14:val="standardContextual"/>
             </w:rPr>
           </w:pPr>
-          <w:hyperlink w:anchor="_Toc241269511" w:history="1">
+          <w:hyperlink w:anchor="_Toc241270438" w:history="1">
             <w:r>
               <w:rPr>
                 <w:rStyle w:val="Hyperlink"/>
@@ -2695,7 +2695,7 @@
               <w:rPr>
                 <w:noProof/>
               </w:rPr>
-              <w:instrText xml:space="preserve"> PAGEREF _Toc241269511 \h </w:instrText>
+              <w:instrText xml:space="preserve"> PAGEREF _Toc241270438 \h </w:instrText>
             </w:r>
             <w:r>
               <w:rPr>
@@ -2738,7 +2738,7 @@
               <w14:ligatures w14:val="standardContextual"/>
             </w:rPr>
           </w:pPr>
-          <w:hyperlink w:anchor="_Toc241269512" w:history="1">
+          <w:hyperlink w:anchor="_Toc241270439" w:history="1">
             <w:r>
               <w:rPr>
                 <w:rStyle w:val="Hyperlink"/>
@@ -2762,7 +2762,7 @@
               <w:rPr>
                 <w:noProof/>
               </w:rPr>
-              <w:instrText xml:space="preserve"> PAGEREF _Toc241269512 \h </w:instrText>
+              <w:instrText xml:space="preserve"> PAGEREF _Toc241270439 \h </w:instrText>
             </w:r>
             <w:r>
               <w:rPr>
@@ -2805,7 +2805,7 @@
               <w14:ligatures w14:val="standardContextual"/>
             </w:rPr>
           </w:pPr>
-          <w:hyperlink w:anchor="_Toc241269513" w:history="1">
+          <w:hyperlink w:anchor="_Toc241270440" w:history="1">
             <w:r>
               <w:rPr>
                 <w:rStyle w:val="Hyperlink"/>
@@ -2829,7 +2829,7 @@
               <w:rPr>
                 <w:noProof/>
               </w:rPr>
-              <w:instrText xml:space="preserve"> PAGEREF _Toc241269513 \h </w:instrText>
+              <w:instrText xml:space="preserve"> PAGEREF _Toc241270440 \h </w:instrText>
             </w:r>
             <w:r>
               <w:rPr>
@@ -2872,7 +2872,7 @@
               <w14:ligatures w14:val="standardContextual"/>
             </w:rPr>
           </w:pPr>
-          <w:hyperlink w:anchor="_Toc241269514" w:history="1">
+          <w:hyperlink w:anchor="_Toc241270441" w:history="1">
             <w:r>
               <w:rPr>
                 <w:rStyle w:val="Hyperlink"/>
@@ -2896,7 +2896,7 @@
               <w:rPr>
                 <w:noProof/>
               </w:rPr>
-              <w:instrText xml:space="preserve"> PAGEREF _Toc241269514 \h </w:instrText>
+              <w:instrText xml:space="preserve"> PAGEREF _Toc241270441 \h </w:instrText>
             </w:r>
             <w:r>
               <w:rPr>
@@ -2939,7 +2939,7 @@
               <w14:ligatures w14:val="standardContextual"/>
             </w:rPr>
           </w:pPr>
-          <w:hyperlink w:anchor="_Toc241269515" w:history="1">
+          <w:hyperlink w:anchor="_Toc241270442" w:history="1">
             <w:r>
               <w:rPr>
                 <w:rStyle w:val="Hyperlink"/>
@@ -2963,7 +2963,7 @@
               <w:rPr>
                 <w:noProof/>
               </w:rPr>
-              <w:instrText xml:space="preserve"> PAGEREF _Toc241269515 \h </w:instrText>
+              <w:instrText xml:space="preserve"> PAGEREF _Toc241270442 \h </w:instrText>
             </w:r>
             <w:r>
               <w:rPr>
@@ -3006,7 +3006,7 @@
               <w14:ligatures w14:val="standardContextual"/>
             </w:rPr>
           </w:pPr>
-          <w:hyperlink w:anchor="_Toc241269516" w:history="1">
+          <w:hyperlink w:anchor="_Toc241270443" w:history="1">
             <w:r>
               <w:rPr>
                 <w:rStyle w:val="Hyperlink"/>
@@ -3030,7 +3030,7 @@
               <w:rPr>
                 <w:noProof/>
               </w:rPr>
-              <w:instrText xml:space="preserve"> PAGEREF _Toc241269516 \h </w:instrText>
+              <w:instrText xml:space="preserve"> PAGEREF _Toc241270443 \h </w:instrText>
             </w:r>
             <w:r>
               <w:rPr>
@@ -3073,7 +3073,7 @@
               <w14:ligatures w14:val="standardContextual"/>
             </w:rPr>
           </w:pPr>
-          <w:hyperlink w:anchor="_Toc241269517" w:history="1">
+          <w:hyperlink w:anchor="_Toc241270444" w:history="1">
             <w:r>
               <w:rPr>
                 <w:rStyle w:val="Hyperlink"/>
@@ -3097,7 +3097,7 @@
               <w:rPr>
                 <w:noProof/>
               </w:rPr>
-              <w:instrText xml:space="preserve"> PAGEREF _Toc241269517 \h </w:instrText>
+              <w:instrText xml:space="preserve"> PAGEREF _Toc241270444 \h </w:instrText>
             </w:r>
             <w:r>
               <w:rPr>
@@ -3140,7 +3140,7 @@
               <w14:ligatures w14:val="standardContextual"/>
             </w:rPr>
           </w:pPr>
-          <w:hyperlink w:anchor="_Toc241269518" w:history="1">
+          <w:hyperlink w:anchor="_Toc241270445" w:history="1">
             <w:r>
               <w:rPr>
                 <w:rStyle w:val="Hyperlink"/>
@@ -3164,7 +3164,7 @@
               <w:rPr>
                 <w:noProof/>
               </w:rPr>
-              <w:instrText xml:space="preserve"> PAGEREF _Toc241269518 \h </w:instrText>
+              <w:instrText xml:space="preserve"> PAGEREF _Toc241270445 \h </w:instrText>
             </w:r>
             <w:r>
               <w:rPr>
@@ -3207,7 +3207,7 @@
               <w14:ligatures w14:val="standardContextual"/>
             </w:rPr>
           </w:pPr>
-          <w:hyperlink w:anchor="_Toc241269519" w:history="1">
+          <w:hyperlink w:anchor="_Toc241270446" w:history="1">
             <w:r>
               <w:rPr>
                 <w:rStyle w:val="Hyperlink"/>
@@ -3231,7 +3231,7 @@
               <w:rPr>
                 <w:noProof/>
               </w:rPr>
-              <w:instrText xml:space="preserve"> PAGEREF _Toc241269519 \h </w:instrText>
+              <w:instrText xml:space="preserve"> PAGEREF _Toc241270446 \h </w:instrText>
             </w:r>
             <w:r>
               <w:rPr>
@@ -3274,7 +3274,7 @@
               <w14:ligatures w14:val="standardContextual"/>
             </w:rPr>
           </w:pPr>
-          <w:hyperlink w:anchor="_Toc241269520" w:history="1">
+          <w:hyperlink w:anchor="_Toc241270447" w:history="1">
             <w:r>
               <w:rPr>
                 <w:rStyle w:val="Hyperlink"/>
@@ -3298,7 +3298,7 @@
               <w:rPr>
                 <w:noProof/>
               </w:rPr>
-              <w:instrText xml:space="preserve"> PAGEREF _Toc241269520 \h </w:instrText>
+              <w:instrText xml:space="preserve"> PAGEREF _Toc241270447 \h </w:instrText>
             </w:r>
             <w:r>
               <w:rPr>
@@ -3341,7 +3341,7 @@
               <w14:ligatures w14:val="standardContextual"/>
             </w:rPr>
           </w:pPr>
-          <w:hyperlink w:anchor="_Toc241269521" w:history="1">
+          <w:hyperlink w:anchor="_Toc241270448" w:history="1">
             <w:r>
               <w:rPr>
                 <w:rStyle w:val="Hyperlink"/>
@@ -3365,7 +3365,7 @@
               <w:rPr>
                 <w:noProof/>
               </w:rPr>
-              <w:instrText xml:space="preserve"> PAGEREF _Toc241269521 \h </w:instrText>
+              <w:instrText xml:space="preserve"> PAGEREF _Toc241270448 \h </w:instrText>
             </w:r>
             <w:r>
               <w:rPr>
@@ -3408,7 +3408,7 @@
               <w14:ligatures w14:val="standardContextual"/>
             </w:rPr>
           </w:pPr>
-          <w:hyperlink w:anchor="_Toc241269522" w:history="1">
+          <w:hyperlink w:anchor="_Toc241270449" w:history="1">
             <w:r>
               <w:rPr>
                 <w:rStyle w:val="Hyperlink"/>
@@ -3432,7 +3432,7 @@
               <w:rPr>
                 <w:noProof/>
               </w:rPr>
-              <w:instrText xml:space="preserve"> PAGEREF _Toc241269522 \h </w:instrText>
+              <w:instrText xml:space="preserve"> PAGEREF _Toc241270449 \h </w:instrText>
             </w:r>
             <w:r>
               <w:rPr>
@@ -3475,7 +3475,7 @@
               <w14:ligatures w14:val="standardContextual"/>
             </w:rPr>
           </w:pPr>
-          <w:hyperlink w:anchor="_Toc241269523" w:history="1">
+          <w:hyperlink w:anchor="_Toc241270450" w:history="1">
             <w:r>
               <w:rPr>
                 <w:rStyle w:val="Hyperlink"/>
@@ -3499,7 +3499,7 @@
               <w:rPr>
                 <w:noProof/>
               </w:rPr>
-              <w:instrText xml:space="preserve"> PAGEREF _Toc241269523 \h </w:instrText>
+              <w:instrText xml:space="preserve"> PAGEREF _Toc241270450 \h </w:instrText>
             </w:r>
             <w:r>
               <w:rPr>
@@ -3542,7 +3542,7 @@
               <w14:ligatures w14:val="standardContextual"/>
             </w:rPr>
           </w:pPr>
-          <w:hyperlink w:anchor="_Toc241269524" w:history="1">
+          <w:hyperlink w:anchor="_Toc241270451" w:history="1">
             <w:r>
               <w:rPr>
                 <w:rStyle w:val="Hyperlink"/>
@@ -3566,7 +3566,7 @@
               <w:rPr>
                 <w:noProof/>
               </w:rPr>
-              <w:instrText xml:space="preserve"> PAGEREF _Toc241269524 \h </w:instrText>
+              <w:instrText xml:space="preserve"> PAGEREF _Toc241270451 \h </w:instrText>
             </w:r>
             <w:r>
               <w:rPr>
@@ -3609,7 +3609,7 @@
               <w14:ligatures w14:val="standardContextual"/>
             </w:rPr>
           </w:pPr>
-          <w:hyperlink w:anchor="_Toc241269525" w:history="1">
+          <w:hyperlink w:anchor="_Toc241270452" w:history="1">
             <w:r>
               <w:rPr>
                 <w:rStyle w:val="Hyperlink"/>
@@ -3633,7 +3633,7 @@
               <w:rPr>
                 <w:noProof/>
               </w:rPr>
-              <w:instrText xml:space="preserve"> PAGEREF _Toc241269525 \h </w:instrText>
+              <w:instrText xml:space="preserve"> PAGEREF _Toc241270452 \h </w:instrText>
             </w:r>
             <w:r>
               <w:rPr>
@@ -3676,7 +3676,7 @@
               <w14:ligatures w14:val="standardContextual"/>
             </w:rPr>
           </w:pPr>
-          <w:hyperlink w:anchor="_Toc241269526" w:history="1">
+          <w:hyperlink w:anchor="_Toc241270453" w:history="1">
             <w:r>
               <w:rPr>
                 <w:rStyle w:val="Hyperlink"/>
@@ -3700,7 +3700,7 @@
               <w:rPr>
                 <w:noProof/>
               </w:rPr>
-              <w:instrText xml:space="preserve"> PAGEREF _Toc241269526 \h </w:instrText>
+              <w:instrText xml:space="preserve"> PAGEREF _Toc241270453 \h </w:instrText>
             </w:r>
             <w:r>
               <w:rPr>
@@ -3743,7 +3743,7 @@
               <w14:ligatures w14:val="standardContextual"/>
             </w:rPr>
           </w:pPr>
-          <w:hyperlink w:anchor="_Toc241269527" w:history="1">
+          <w:hyperlink w:anchor="_Toc241270454" w:history="1">
             <w:r>
               <w:rPr>
                 <w:rStyle w:val="Hyperlink"/>
@@ -3767,7 +3767,7 @@
               <w:rPr>
                 <w:noProof/>
               </w:rPr>
-              <w:instrText xml:space="preserve"> PAGEREF _Toc241269527 \h </w:instrText>
+              <w:instrText xml:space="preserve"> PAGEREF _Toc241270454 \h </w:instrText>
             </w:r>
             <w:r>
               <w:rPr>
@@ -3810,7 +3810,7 @@
               <w14:ligatures w14:val="standardContextual"/>
             </w:rPr>
           </w:pPr>
-          <w:hyperlink w:anchor="_Toc241269528" w:history="1">
+          <w:hyperlink w:anchor="_Toc241270455" w:history="1">
             <w:r>
               <w:rPr>
                 <w:rStyle w:val="Hyperlink"/>
@@ -3834,7 +3834,7 @@
               <w:rPr>
                 <w:noProof/>
               </w:rPr>
-              <w:instrText xml:space="preserve"> PAGEREF _Toc241269528 \h </w:instrText>
+              <w:instrText xml:space="preserve"> PAGEREF _Toc241270455 \h </w:instrText>
             </w:r>
             <w:r>
               <w:rPr>
@@ -3877,7 +3877,7 @@
               <w14:ligatures w14:val="standardContextual"/>
             </w:rPr>
           </w:pPr>
-          <w:hyperlink w:anchor="_Toc241269529" w:history="1">
+          <w:hyperlink w:anchor="_Toc241270456" w:history="1">
             <w:r>
               <w:rPr>
                 <w:rStyle w:val="Hyperlink"/>
@@ -3901,7 +3901,7 @@
               <w:rPr>
                 <w:noProof/>
               </w:rPr>
-              <w:instrText xml:space="preserve"> PAGEREF _Toc241269529 \h </w:instrText>
+              <w:instrText xml:space="preserve"> PAGEREF _Toc241270456 \h </w:instrText>
             </w:r>
             <w:r>
               <w:rPr>
@@ -3944,7 +3944,7 @@
               <w14:ligatures w14:val="standardContextual"/>
             </w:rPr>
           </w:pPr>
-          <w:hyperlink w:anchor="_Toc241269530" w:history="1">
+          <w:hyperlink w:anchor="_Toc241270457" w:history="1">
             <w:r>
               <w:rPr>
                 <w:rStyle w:val="Hyperlink"/>
@@ -3968,7 +3968,7 @@
               <w:rPr>
                 <w:noProof/>
               </w:rPr>
-              <w:instrText xml:space="preserve"> PAGEREF _Toc241269530 \h </w:instrText>
+              <w:instrText xml:space="preserve"> PAGEREF _Toc241270457 \h </w:instrText>
             </w:r>
             <w:r>
               <w:rPr>
@@ -4011,7 +4011,7 @@
               <w14:ligatures w14:val="standardContextual"/>
             </w:rPr>
           </w:pPr>
-          <w:hyperlink w:anchor="_Toc241269531" w:history="1">
+          <w:hyperlink w:anchor="_Toc241270458" w:history="1">
             <w:r>
               <w:rPr>
                 <w:rStyle w:val="Hyperlink"/>
@@ -4035,7 +4035,7 @@
               <w:rPr>
                 <w:noProof/>
               </w:rPr>
-              <w:instrText xml:space="preserve"> PAGEREF _Toc241269531 \h </w:instrText>
+              <w:instrText xml:space="preserve"> PAGEREF _Toc241270458 \h </w:instrText>
             </w:r>
             <w:r>
               <w:rPr>
@@ -4078,7 +4078,7 @@
               <w14:ligatures w14:val="standardContextual"/>
             </w:rPr>
           </w:pPr>
-          <w:hyperlink w:anchor="_Toc241269532" w:history="1">
+          <w:hyperlink w:anchor="_Toc241270459" w:history="1">
             <w:r>
               <w:rPr>
                 <w:rStyle w:val="Hyperlink"/>
@@ -4102,7 +4102,7 @@
               <w:rPr>
                 <w:noProof/>
               </w:rPr>
-              <w:instrText xml:space="preserve"> PAGEREF _Toc241269532 \h </w:instrText>
+              <w:instrText xml:space="preserve"> PAGEREF _Toc241270459 \h </w:instrText>
             </w:r>
             <w:r>
               <w:rPr>
@@ -4145,7 +4145,7 @@
               <w14:ligatures w14:val="standardContextual"/>
             </w:rPr>
           </w:pPr>
-          <w:hyperlink w:anchor="_Toc241269533" w:history="1">
+          <w:hyperlink w:anchor="_Toc241270460" w:history="1">
             <w:r>
               <w:rPr>
                 <w:rStyle w:val="Hyperlink"/>
@@ -4169,7 +4169,7 @@
               <w:rPr>
                 <w:noProof/>
               </w:rPr>
-              <w:instrText xml:space="preserve"> PAGEREF _Toc241269533 \h </w:instrText>
+              <w:instrText xml:space="preserve"> PAGEREF _Toc241270460 \h </w:instrText>
             </w:r>
             <w:r>
               <w:rPr>
@@ -4212,7 +4212,7 @@
               <w14:ligatures w14:val="standardContextual"/>
             </w:rPr>
           </w:pPr>
-          <w:hyperlink w:anchor="_Toc241269534" w:history="1">
+          <w:hyperlink w:anchor="_Toc241270461" w:history="1">
             <w:r>
               <w:rPr>
                 <w:rStyle w:val="Hyperlink"/>
@@ -4236,7 +4236,7 @@
               <w:rPr>
                 <w:noProof/>
               </w:rPr>
-              <w:instrText xml:space="preserve"> PAGEREF _Toc241269534 \h </w:instrText>
+              <w:instrText xml:space="preserve"> PAGEREF _Toc241270461 \h </w:instrText>
             </w:r>
             <w:r>
               <w:rPr>
@@ -4279,7 +4279,7 @@
               <w14:ligatures w14:val="standardContextual"/>
             </w:rPr>
           </w:pPr>
-          <w:hyperlink w:anchor="_Toc241269535" w:history="1">
+          <w:hyperlink w:anchor="_Toc241270462" w:history="1">
             <w:r>
               <w:rPr>
                 <w:rStyle w:val="Hyperlink"/>
@@ -4303,7 +4303,7 @@
               <w:rPr>
                 <w:noProof/>
               </w:rPr>
-              <w:instrText xml:space="preserve"> PAGEREF _Toc241269535 \h </w:instrText>
+              <w:instrText xml:space="preserve"> PAGEREF _Toc241270462 \h </w:instrText>
             </w:r>
             <w:r>
               <w:rPr>
@@ -4346,7 +4346,7 @@
               <w14:ligatures w14:val="standardContextual"/>
             </w:rPr>
           </w:pPr>
-          <w:hyperlink w:anchor="_Toc241269536" w:history="1">
+          <w:hyperlink w:anchor="_Toc241270463" w:history="1">
             <w:r>
               <w:rPr>
                 <w:rStyle w:val="Hyperlink"/>
@@ -4370,7 +4370,7 @@
               <w:rPr>
                 <w:noProof/>
               </w:rPr>
-              <w:instrText xml:space="preserve"> PAGEREF _Toc241269536 \h </w:instrText>
+              <w:instrText xml:space="preserve"> PAGEREF _Toc241270463 \h </w:instrText>
             </w:r>
             <w:r>
               <w:rPr>
@@ -4413,7 +4413,7 @@
               <w14:ligatures w14:val="standardContextual"/>
             </w:rPr>
           </w:pPr>
-          <w:hyperlink w:anchor="_Toc241269537" w:history="1">
+          <w:hyperlink w:anchor="_Toc241270464" w:history="1">
             <w:r>
               <w:rPr>
                 <w:rStyle w:val="Hyperlink"/>
@@ -4437,7 +4437,7 @@
               <w:rPr>
                 <w:noProof/>
               </w:rPr>
-              <w:instrText xml:space="preserve"> PAGEREF _Toc241269537 \h </w:instrText>
+              <w:instrText xml:space="preserve"> PAGEREF _Toc241270464 \h </w:instrText>
             </w:r>
             <w:r>
               <w:rPr>
@@ -4480,7 +4480,7 @@
               <w14:ligatures w14:val="standardContextual"/>
             </w:rPr>
           </w:pPr>
-          <w:hyperlink w:anchor="_Toc241269538" w:history="1">
+          <w:hyperlink w:anchor="_Toc241270465" w:history="1">
             <w:r>
               <w:rPr>
                 <w:rStyle w:val="Hyperlink"/>
@@ -4504,7 +4504,7 @@
               <w:rPr>
                 <w:noProof/>
               </w:rPr>
-              <w:instrText xml:space="preserve"> PAGEREF _Toc241269538 \h </w:instrText>
+              <w:instrText xml:space="preserve"> PAGEREF _Toc241270465 \h </w:instrText>
             </w:r>
             <w:r>
               <w:rPr>
@@ -4547,7 +4547,7 @@
               <w14:ligatures w14:val="standardContextual"/>
             </w:rPr>
           </w:pPr>
-          <w:hyperlink w:anchor="_Toc241269539" w:history="1">
+          <w:hyperlink w:anchor="_Toc241270466" w:history="1">
             <w:r>
               <w:rPr>
                 <w:rStyle w:val="Hyperlink"/>
@@ -4571,7 +4571,7 @@
               <w:rPr>
                 <w:noProof/>
               </w:rPr>
-              <w:instrText xml:space="preserve"> PAGEREF _Toc241269539 \h </w:instrText>
+              <w:instrText xml:space="preserve"> PAGEREF _Toc241270466 \h </w:instrText>
             </w:r>
             <w:r>
               <w:rPr>
@@ -4614,7 +4614,7 @@
               <w14:ligatures w14:val="standardContextual"/>
             </w:rPr>
           </w:pPr>
-          <w:hyperlink w:anchor="_Toc241269540" w:history="1">
+          <w:hyperlink w:anchor="_Toc241270467" w:history="1">
             <w:r>
               <w:rPr>
                 <w:rStyle w:val="Hyperlink"/>
@@ -4638,7 +4638,7 @@
               <w:rPr>
                 <w:noProof/>
               </w:rPr>
-              <w:instrText xml:space="preserve"> PAGEREF _Toc241269540 \h </w:instrText>
+              <w:instrText xml:space="preserve"> PAGEREF _Toc241270467 \h </w:instrText>
             </w:r>
             <w:r>
               <w:rPr>
@@ -4681,7 +4681,7 @@
               <w14:ligatures w14:val="standardContextual"/>
             </w:rPr>
           </w:pPr>
-          <w:hyperlink w:anchor="_Toc241269541" w:history="1">
+          <w:hyperlink w:anchor="_Toc241270468" w:history="1">
             <w:r>
               <w:rPr>
                 <w:rStyle w:val="Hyperlink"/>
@@ -4705,7 +4705,7 @@
               <w:rPr>
                 <w:noProof/>
               </w:rPr>
-              <w:instrText xml:space="preserve"> PAGEREF _Toc241269541 \h </w:instrText>
+              <w:instrText xml:space="preserve"> PAGEREF _Toc241270468 \h </w:instrText>
             </w:r>
             <w:r>
               <w:rPr>
@@ -4748,7 +4748,7 @@
               <w14:ligatures w14:val="standardContextual"/>
             </w:rPr>
           </w:pPr>
-          <w:hyperlink w:anchor="_Toc241269542" w:history="1">
+          <w:hyperlink w:anchor="_Toc241270469" w:history="1">
             <w:r>
               <w:rPr>
                 <w:rStyle w:val="Hyperlink"/>
@@ -4772,7 +4772,7 @@
               <w:rPr>
                 <w:noProof/>
               </w:rPr>
-              <w:instrText xml:space="preserve"> PAGEREF _Toc241269542 \h </w:instrText>
+              <w:instrText xml:space="preserve"> PAGEREF _Toc241270469 \h </w:instrText>
             </w:r>
             <w:r>
               <w:rPr>
@@ -4815,7 +4815,7 @@
               <w14:ligatures w14:val="standardContextual"/>
             </w:rPr>
           </w:pPr>
-          <w:hyperlink w:anchor="_Toc241269543" w:history="1">
+          <w:hyperlink w:anchor="_Toc241270470" w:history="1">
             <w:r>
               <w:rPr>
                 <w:rStyle w:val="Hyperlink"/>
@@ -4839,7 +4839,7 @@
               <w:rPr>
                 <w:noProof/>
               </w:rPr>
-              <w:instrText xml:space="preserve"> PAGEREF _Toc241269543 \h </w:instrText>
+              <w:instrText xml:space="preserve"> PAGEREF _Toc241270470 \h </w:instrText>
             </w:r>
             <w:r>
               <w:rPr>
@@ -4882,7 +4882,7 @@
               <w14:ligatures w14:val="standardContextual"/>
             </w:rPr>
           </w:pPr>
-          <w:hyperlink w:anchor="_Toc241269544" w:history="1">
+          <w:hyperlink w:anchor="_Toc241270471" w:history="1">
             <w:r>
               <w:rPr>
                 <w:rStyle w:val="Hyperlink"/>
@@ -4906,7 +4906,7 @@
               <w:rPr>
                 <w:noProof/>
               </w:rPr>
-              <w:instrText xml:space="preserve"> PAGEREF _Toc241269544 \h </w:instrText>
+              <w:instrText xml:space="preserve"> PAGEREF _Toc241270471 \h </w:instrText>
             </w:r>
             <w:r>
               <w:rPr>
@@ -4954,7 +4954,7 @@
       <w:pPr>
         <w:pStyle w:val="Heading1"/>
       </w:pPr>
-      <w:bookmarkStart w:id="0" w:name="_Toc241269474"/>
+      <w:bookmarkStart w:id="0" w:name="_Toc241270401"/>
       <w:r>
         <w:t>Introduction: the idea in one page</w:t>
       </w:r>
@@ -5071,7 +5071,7 @@
           <w:noProof/>
         </w:rPr>
         <w:drawing>
-          <wp:inline distT="0" distB="0" distL="0" distR="0" wp14:anchorId="259BEEA1" wp14:editId="6A1E66A9">
+          <wp:inline distT="0" distB="0" distL="0" distR="0" wp14:anchorId="01BA5CF4" wp14:editId="658C9D9B">
             <wp:extent cx="5715000" cy="2905125"/>
             <wp:effectExtent l="0" t="0" r="0" b="0"/>
             <wp:docPr id="1" name="01_growth.png" descr="Growth of ₹1 with the momentum rules in this book, against the Nifty 500 index (Oct 2020 to Sep 2026). Log scale: equal percentage moves look the same size." title="Growth of ₹1 with the momentum rules in this book, against the Nifty 500 index (Oct 2020 to Sep 2026). Log scale: equal percentage moves look the same size."/>
@@ -5139,7 +5139,7 @@
         <w:pStyle w:val="Heading1"/>
         <w:pageBreakBefore/>
       </w:pPr>
-      <w:bookmarkStart w:id="1" w:name="_Toc241269475"/>
+      <w:bookmarkStart w:id="1" w:name="_Toc241270402"/>
       <w:r>
         <w:t>1. What is momentum investing?</w:t>
       </w:r>
@@ -5167,7 +5167,7 @@
       <w:pPr>
         <w:pStyle w:val="Heading2"/>
       </w:pPr>
-      <w:bookmarkStart w:id="2" w:name="_Toc241269476"/>
+      <w:bookmarkStart w:id="2" w:name="_Toc241270403"/>
       <w:r>
         <w:t>A simple example</w:t>
       </w:r>
@@ -5192,10 +5192,10 @@
           <w:noProof/>
         </w:rPr>
         <w:drawing>
-          <wp:inline distT="0" distB="0" distL="0" distR="0" wp14:anchorId="2B5548DF" wp14:editId="01D966EF">
+          <wp:inline distT="0" distB="0" distL="0" distR="0" wp14:anchorId="5E874084" wp14:editId="05C2E671">
             <wp:extent cx="5715000" cy="2371725"/>
             <wp:effectExtent l="0" t="0" r="0" b="0"/>
-            <wp:docPr id="2004486255" name="08_concept.png" descr="Two made-up stocks with the same one-year gain. A climbed steadily; B lurched up and down. A momentum investor prefers A." title="Two made-up stocks with the same one-year gain. A climbed steadily; B lurched up and down. A momentum investor prefers A."/>
+            <wp:docPr id="18124745" name="08_concept.png" descr="Two made-up stocks with the same one-year gain. A climbed steadily; B lurched up and down. A momentum investor prefers A." title="Two made-up stocks with the same one-year gain. A climbed steadily; B lurched up and down. A momentum investor prefers A."/>
             <wp:cNvGraphicFramePr>
               <a:graphicFrameLocks xmlns:a="http://schemas.openxmlformats.org/drawingml/2006/main" noChangeAspect="1"/>
             </wp:cNvGraphicFramePr>
@@ -5287,7 +5287,7 @@
       <w:pPr>
         <w:pStyle w:val="Heading2"/>
       </w:pPr>
-      <w:bookmarkStart w:id="3" w:name="_Toc241269477"/>
+      <w:bookmarkStart w:id="3" w:name="_Toc241270404"/>
       <w:r>
         <w:t>Two kinds of momentum</w:t>
       </w:r>
@@ -5373,7 +5373,7 @@
       <w:pPr>
         <w:pStyle w:val="Heading2"/>
       </w:pPr>
-      <w:bookmarkStart w:id="4" w:name="_Toc241269478"/>
+      <w:bookmarkStart w:id="4" w:name="_Toc241270405"/>
       <w:r>
         <w:t>How momentum differs from other styles</w:t>
       </w:r>
@@ -6082,7 +6082,7 @@
       <w:pPr>
         <w:pStyle w:val="Heading2"/>
       </w:pPr>
-      <w:bookmarkStart w:id="5" w:name="_Toc241269479"/>
+      <w:bookmarkStart w:id="5" w:name="_Toc241270406"/>
       <w:r>
         <w:t>What momentum is not</w:t>
       </w:r>
@@ -6203,7 +6203,7 @@
         <w:pStyle w:val="Heading1"/>
         <w:pageBreakBefore/>
       </w:pPr>
-      <w:bookmarkStart w:id="6" w:name="_Toc241269480"/>
+      <w:bookmarkStart w:id="6" w:name="_Toc241270407"/>
       <w:r>
         <w:t>2. A short history of momentum</w:t>
       </w:r>
@@ -6221,7 +6221,7 @@
       <w:pPr>
         <w:pStyle w:val="Heading2"/>
       </w:pPr>
-      <w:bookmarkStart w:id="7" w:name="_Toc241269481"/>
+      <w:bookmarkStart w:id="7" w:name="_Toc241270408"/>
       <w:r>
         <w:t>The traders (1900s to 1980s)</w:t>
       </w:r>
@@ -6411,7 +6411,7 @@
       <w:pPr>
         <w:pStyle w:val="Heading2"/>
       </w:pPr>
-      <w:bookmarkStart w:id="8" w:name="_Toc241269482"/>
+      <w:bookmarkStart w:id="8" w:name="_Toc241270409"/>
       <w:r>
         <w:t>The academics catch up (1990s onwards)</w:t>
       </w:r>
@@ -6569,7 +6569,7 @@
       <w:pPr>
         <w:pStyle w:val="Heading2"/>
       </w:pPr>
-      <w:bookmarkStart w:id="9" w:name="_Toc241269483"/>
+      <w:bookmarkStart w:id="9" w:name="_Toc241270410"/>
       <w:r>
         <w:t>Momentum in India</w:t>
       </w:r>
@@ -6627,7 +6627,7 @@
         <w:pStyle w:val="Heading1"/>
         <w:pageBreakBefore/>
       </w:pPr>
-      <w:bookmarkStart w:id="10" w:name="_Toc241269484"/>
+      <w:bookmarkStart w:id="10" w:name="_Toc241270411"/>
       <w:r>
         <w:t>3. Why does momentum work, and why doesn't everyone do it?</w:t>
       </w:r>
@@ -6645,7 +6645,7 @@
       <w:pPr>
         <w:pStyle w:val="Heading2"/>
       </w:pPr>
-      <w:bookmarkStart w:id="11" w:name="_Toc241269485"/>
+      <w:bookmarkStart w:id="11" w:name="_Toc241270412"/>
       <w:r>
         <w:t>Human behaviour</w:t>
       </w:r>
@@ -6745,7 +6745,7 @@
       <w:pPr>
         <w:pStyle w:val="Heading2"/>
       </w:pPr>
-      <w:bookmarkStart w:id="12" w:name="_Toc241269486"/>
+      <w:bookmarkStart w:id="12" w:name="_Toc241270413"/>
       <w:r>
         <w:t>Risk</w:t>
       </w:r>
@@ -6773,7 +6773,7 @@
       <w:pPr>
         <w:pStyle w:val="Heading2"/>
       </w:pPr>
-      <w:bookmarkStart w:id="13" w:name="_Toc241269487"/>
+      <w:bookmarkStart w:id="13" w:name="_Toc241270414"/>
       <w:r>
         <w:t>Why it hasn't been "arbitraged away"</w:t>
       </w:r>
@@ -6864,7 +6864,7 @@
       <w:pPr>
         <w:pStyle w:val="Heading2"/>
       </w:pPr>
-      <w:bookmarkStart w:id="14" w:name="_Toc241269488"/>
+      <w:bookmarkStart w:id="14" w:name="_Toc241270415"/>
       <w:r>
         <w:t>Who momentum suits, and who it doesn't</w:t>
       </w:r>
@@ -7312,7 +7312,7 @@
         <w:pStyle w:val="Heading1"/>
         <w:pageBreakBefore/>
       </w:pPr>
-      <w:bookmarkStart w:id="15" w:name="_Toc241269489"/>
+      <w:bookmarkStart w:id="15" w:name="_Toc241270416"/>
       <w:r>
         <w:t>4. The strategy tested in this book</w:t>
       </w:r>
@@ -7330,7 +7330,7 @@
       <w:pPr>
         <w:pStyle w:val="Heading2"/>
       </w:pPr>
-      <w:bookmarkStart w:id="16" w:name="_Toc241269490"/>
+      <w:bookmarkStart w:id="16" w:name="_Toc241270417"/>
       <w:r>
         <w:t>The monthly routine</w:t>
       </w:r>
@@ -7460,7 +7460,7 @@
       <w:pPr>
         <w:pStyle w:val="Heading2"/>
       </w:pPr>
-      <w:bookmarkStart w:id="17" w:name="_Toc241269491"/>
+      <w:bookmarkStart w:id="17" w:name="_Toc241270418"/>
       <w:r>
         <w:t>The safety switch (checked every day)</w:t>
       </w:r>
@@ -7552,7 +7552,7 @@
       <w:pPr>
         <w:pStyle w:val="Heading2"/>
       </w:pPr>
-      <w:bookmarkStart w:id="18" w:name="_Toc241269492"/>
+      <w:bookmarkStart w:id="18" w:name="_Toc241270419"/>
       <w:r>
         <w:t>How the score works</w:t>
       </w:r>
@@ -8109,7 +8109,7 @@
       <w:pPr>
         <w:pStyle w:val="Heading2"/>
       </w:pPr>
-      <w:bookmarkStart w:id="19" w:name="_Toc241269493"/>
+      <w:bookmarkStart w:id="19" w:name="_Toc241270420"/>
       <w:r>
         <w:t>Why these particular rules?</w:t>
       </w:r>
@@ -8248,7 +8248,7 @@
         <w:pStyle w:val="Heading1"/>
         <w:pageBreakBefore/>
       </w:pPr>
-      <w:bookmarkStart w:id="20" w:name="_Toc241269494"/>
+      <w:bookmarkStart w:id="20" w:name="_Toc241270421"/>
       <w:r>
         <w:t>5. How we tested it honestly</w:t>
       </w:r>
@@ -8276,7 +8276,7 @@
       <w:pPr>
         <w:pStyle w:val="Heading2"/>
       </w:pPr>
-      <w:bookmarkStart w:id="21" w:name="_Toc241269495"/>
+      <w:bookmarkStart w:id="21" w:name="_Toc241270422"/>
       <w:r>
         <w:t>Trap 1: using today's list of stocks for the past</w:t>
       </w:r>
@@ -8782,10 +8782,10 @@
           <w:noProof/>
         </w:rPr>
         <w:drawing>
-          <wp:inline distT="0" distB="0" distL="0" distR="0" wp14:anchorId="0C4EA316" wp14:editId="3FD348AE">
+          <wp:inline distT="0" distB="0" distL="0" distR="0" wp14:anchorId="210F3267" wp14:editId="5F0D597B">
             <wp:extent cx="5715000" cy="2638425"/>
             <wp:effectExtent l="0" t="0" r="0" b="0"/>
-            <wp:docPr id="86727017" name="04_survivorship.png" descr="The same strategy, tested on today's list (biased) and on the list as it stood each month (honest)." title="The same strategy, tested on today's list (biased) and on the list as it stood each month (honest)."/>
+            <wp:docPr id="387873840" name="04_survivorship.png" descr="The same strategy, tested on today's list (biased) and on the list as it stood each month (honest)." title="The same strategy, tested on today's list (biased) and on the list as it stood each month (honest)."/>
             <wp:cNvGraphicFramePr>
               <a:graphicFrameLocks xmlns:a="http://schemas.openxmlformats.org/drawingml/2006/main" noChangeAspect="1"/>
             </wp:cNvGraphicFramePr>
@@ -8887,7 +8887,7 @@
       <w:pPr>
         <w:pStyle w:val="Heading2"/>
       </w:pPr>
-      <w:bookmarkStart w:id="22" w:name="_Toc241269496"/>
+      <w:bookmarkStart w:id="22" w:name="_Toc241270423"/>
       <w:r>
         <w:t>Trap 2: ignoring costs and taxes</w:t>
       </w:r>
@@ -8915,7 +8915,7 @@
       <w:pPr>
         <w:pStyle w:val="Heading2"/>
       </w:pPr>
-      <w:bookmarkStart w:id="23" w:name="_Toc241269497"/>
+      <w:bookmarkStart w:id="23" w:name="_Toc241270424"/>
       <w:r>
         <w:t>Trap 3: trying many rules and keeping the best</w:t>
       </w:r>
@@ -8933,7 +8933,7 @@
       <w:pPr>
         <w:pStyle w:val="Heading2"/>
       </w:pPr>
-      <w:bookmarkStart w:id="24" w:name="_Toc241269498"/>
+      <w:bookmarkStart w:id="24" w:name="_Toc241270425"/>
       <w:r>
         <w:t>What the test can't do</w:t>
       </w:r>
@@ -9044,7 +9044,7 @@
         <w:pStyle w:val="Heading1"/>
         <w:pageBreakBefore/>
       </w:pPr>
-      <w:bookmarkStart w:id="25" w:name="_Toc241269499"/>
+      <w:bookmarkStart w:id="25" w:name="_Toc241270426"/>
       <w:r>
         <w:t>6. The results</w:t>
       </w:r>
@@ -9054,7 +9054,7 @@
       <w:pPr>
         <w:pStyle w:val="Heading2"/>
       </w:pPr>
-      <w:bookmarkStart w:id="26" w:name="_Toc241269500"/>
+      <w:bookmarkStart w:id="26" w:name="_Toc241270427"/>
       <w:r>
         <w:t>The headline numbers</w:t>
       </w:r>
@@ -9935,7 +9935,7 @@
       <w:pPr>
         <w:pStyle w:val="Heading2"/>
       </w:pPr>
-      <w:bookmarkStart w:id="27" w:name="_Toc241269501"/>
+      <w:bookmarkStart w:id="27" w:name="_Toc241270428"/>
       <w:r>
         <w:t>Year by year</w:t>
       </w:r>
@@ -9952,10 +9952,10 @@
           <w:noProof/>
         </w:rPr>
         <w:drawing>
-          <wp:inline distT="0" distB="0" distL="0" distR="0" wp14:anchorId="279802D6" wp14:editId="0DB188D0">
+          <wp:inline distT="0" distB="0" distL="0" distR="0" wp14:anchorId="1E2EA924" wp14:editId="7F1B7B4D">
             <wp:extent cx="5715000" cy="2638425"/>
             <wp:effectExtent l="0" t="0" r="0" b="0"/>
-            <wp:docPr id="1487728440" name="03_yearly.png" descr="Return in each calendar year. * 2020 and 2026 are part-years." title="Return in each calendar year. * 2020 and 2026 are part-years."/>
+            <wp:docPr id="821222878" name="03_yearly.png" descr="Return in each calendar year. * 2020 and 2026 are part-years." title="Return in each calendar year. * 2020 and 2026 are part-years."/>
             <wp:cNvGraphicFramePr>
               <a:graphicFrameLocks xmlns:a="http://schemas.openxmlformats.org/drawingml/2006/main" noChangeAspect="1"/>
             </wp:cNvGraphicFramePr>
@@ -11108,7 +11108,7 @@
       <w:pPr>
         <w:pStyle w:val="Heading2"/>
       </w:pPr>
-      <w:bookmarkStart w:id="28" w:name="_Toc241269502"/>
+      <w:bookmarkStart w:id="28" w:name="_Toc241270429"/>
       <w:r>
         <w:t>The falls</w:t>
       </w:r>
@@ -11125,10 +11125,10 @@
           <w:noProof/>
         </w:rPr>
         <w:drawing>
-          <wp:inline distT="0" distB="0" distL="0" distR="0" wp14:anchorId="6EDA4876" wp14:editId="471AB9D9">
+          <wp:inline distT="0" distB="0" distL="0" distR="0" wp14:anchorId="5C564623" wp14:editId="74CD8EA5">
             <wp:extent cx="5715000" cy="2286000"/>
             <wp:effectExtent l="0" t="0" r="0" b="0"/>
-            <wp:docPr id="1118889210" name="02_drawdown.png" descr="How far the strategy and the index were below their previous high at each point." title="How far the strategy and the index were below their previous high at each point."/>
+            <wp:docPr id="1454968524" name="02_drawdown.png" descr="How far the strategy and the index were below their previous high at each point." title="How far the strategy and the index were below their previous high at each point."/>
             <wp:cNvGraphicFramePr>
               <a:graphicFrameLocks xmlns:a="http://schemas.openxmlformats.org/drawingml/2006/main" noChangeAspect="1"/>
             </wp:cNvGraphicFramePr>
@@ -12013,7 +12013,7 @@
       <w:pPr>
         <w:pStyle w:val="Heading2"/>
       </w:pPr>
-      <w:bookmarkStart w:id="29" w:name="_Toc241269503"/>
+      <w:bookmarkStart w:id="29" w:name="_Toc241270430"/>
       <w:r>
         <w:t>Month by month</w:t>
       </w:r>
@@ -12041,7 +12041,7 @@
       <w:pPr>
         <w:pStyle w:val="Heading2"/>
       </w:pPr>
-      <w:bookmarkStart w:id="30" w:name="_Toc241269504"/>
+      <w:bookmarkStart w:id="30" w:name="_Toc241270431"/>
       <w:r>
         <w:t>The trades</w:t>
       </w:r>
@@ -13747,7 +13747,7 @@
         <w:pStyle w:val="Heading1"/>
         <w:pageBreakBefore/>
       </w:pPr>
-      <w:bookmarkStart w:id="31" w:name="_Toc241269505"/>
+      <w:bookmarkStart w:id="31" w:name="_Toc241270432"/>
       <w:r>
         <w:t>7. Stress tests: is it real?</w:t>
       </w:r>
@@ -13765,7 +13765,7 @@
       <w:pPr>
         <w:pStyle w:val="Heading2"/>
       </w:pPr>
-      <w:bookmarkStart w:id="32" w:name="_Toc241269506"/>
+      <w:bookmarkStart w:id="32" w:name="_Toc241270433"/>
       <w:r>
         <w:t>Test 1: skill or luck?</w:t>
       </w:r>
@@ -13810,10 +13810,10 @@
           <w:noProof/>
         </w:rPr>
         <w:drawing>
-          <wp:inline distT="0" distB="0" distL="0" distR="0" wp14:anchorId="675891B9" wp14:editId="4BDB4285">
+          <wp:inline distT="0" distB="0" distL="0" distR="0" wp14:anchorId="0CE6394B" wp14:editId="7730B4B4">
             <wp:extent cx="5715000" cy="2371725"/>
             <wp:effectExtent l="0" t="0" r="0" b="0"/>
-            <wp:docPr id="366897022" name="05_luck.png" descr="Yearly returns of 200 random copies (grey bars) and the real strategy (red line)." title="Yearly returns of 200 random copies (grey bars) and the real strategy (red line)."/>
+            <wp:docPr id="1415631136" name="05_luck.png" descr="Yearly returns of 200 random copies (grey bars) and the real strategy (red line)." title="Yearly returns of 200 random copies (grey bars) and the real strategy (red line)."/>
             <wp:cNvGraphicFramePr>
               <a:graphicFrameLocks xmlns:a="http://schemas.openxmlformats.org/drawingml/2006/main" noChangeAspect="1"/>
             </wp:cNvGraphicFramePr>
@@ -13905,7 +13905,7 @@
       <w:pPr>
         <w:pStyle w:val="Heading2"/>
       </w:pPr>
-      <w:bookmarkStart w:id="33" w:name="_Toc241269507"/>
+      <w:bookmarkStart w:id="33" w:name="_Toc241270434"/>
       <w:r>
         <w:t>Test 2: does it depend on one lucky setting?</w:t>
       </w:r>
@@ -16555,7 +16555,7 @@
       <w:pPr>
         <w:pStyle w:val="Heading2"/>
       </w:pPr>
-      <w:bookmarkStart w:id="34" w:name="_Toc241269508"/>
+      <w:bookmarkStart w:id="34" w:name="_Toc241270435"/>
       <w:r>
         <w:t>Test 3: was the trading day lucky?</w:t>
       </w:r>
@@ -17532,7 +17532,7 @@
       <w:pPr>
         <w:pStyle w:val="Heading2"/>
       </w:pPr>
-      <w:bookmarkStart w:id="35" w:name="_Toc241269509"/>
+      <w:bookmarkStart w:id="35" w:name="_Toc241270436"/>
       <w:r>
         <w:t>Test 4: survivorship bias</w:t>
       </w:r>
@@ -17551,7 +17551,7 @@
         <w:pStyle w:val="Heading1"/>
         <w:pageBreakBefore/>
       </w:pPr>
-      <w:bookmarkStart w:id="36" w:name="_Toc241269510"/>
+      <w:bookmarkStart w:id="36" w:name="_Toc241270437"/>
       <w:r>
         <w:t>8. The safety switch: getting out of the way</w:t>
       </w:r>
@@ -17576,10 +17576,10 @@
           <w:noProof/>
         </w:rPr>
         <w:drawing>
-          <wp:inline distT="0" distB="0" distL="0" distR="0" wp14:anchorId="3593B9C4" wp14:editId="7F4A58AF">
+          <wp:inline distT="0" distB="0" distL="0" distR="0" wp14:anchorId="22916204" wp14:editId="3E69FA69">
             <wp:extent cx="5715000" cy="2809875"/>
             <wp:effectExtent l="0" t="0" r="0" b="0"/>
-            <wp:docPr id="2044081748" name="06_switch.png" descr="The Nifty 500, its 200-day average, and the periods the strategy spent in the liquid fund (shaded)." title="The Nifty 500, its 200-day average, and the periods the strategy spent in the liquid fund (shaded)."/>
+            <wp:docPr id="1442509088" name="06_switch.png" descr="The Nifty 500, its 200-day average, and the periods the strategy spent in the liquid fund (shaded)." title="The Nifty 500, its 200-day average, and the periods the strategy spent in the liquid fund (shaded)."/>
             <wp:cNvGraphicFramePr>
               <a:graphicFrameLocks xmlns:a="http://schemas.openxmlformats.org/drawingml/2006/main" noChangeAspect="1"/>
             </wp:cNvGraphicFramePr>
@@ -17643,7 +17643,7 @@
       <w:pPr>
         <w:pStyle w:val="Heading2"/>
       </w:pPr>
-      <w:bookmarkStart w:id="37" w:name="_Toc241269511"/>
+      <w:bookmarkStart w:id="37" w:name="_Toc241270438"/>
       <w:r>
         <w:t>Every time the switch moved to cash</w:t>
       </w:r>
@@ -18598,7 +18598,7 @@
       <w:pPr>
         <w:pStyle w:val="Heading2"/>
       </w:pPr>
-      <w:bookmarkStart w:id="38" w:name="_Toc241269512"/>
+      <w:bookmarkStart w:id="38" w:name="_Toc241270439"/>
       <w:r>
         <w:t>Checking daily vs. once a month</w:t>
       </w:r>
@@ -19575,7 +19575,7 @@
       <w:pPr>
         <w:pStyle w:val="Heading2"/>
       </w:pPr>
-      <w:bookmarkStart w:id="39" w:name="_Toc241269513"/>
+      <w:bookmarkStart w:id="39" w:name="_Toc241270440"/>
       <w:r>
         <w:t>Which moving average?</w:t>
       </w:r>
@@ -20760,10 +20760,10 @@
           <w:noProof/>
         </w:rPr>
         <w:drawing>
-          <wp:inline distT="0" distB="0" distL="0" distR="0" wp14:anchorId="62393286" wp14:editId="47542FBF">
+          <wp:inline distT="0" distB="0" distL="0" distR="0" wp14:anchorId="02B86883" wp14:editId="778E1F4F">
             <wp:extent cx="5715000" cy="2809875"/>
             <wp:effectExtent l="0" t="0" r="0" b="0"/>
-            <wp:docPr id="536215948" name="07_moving_averages.png" descr="Growth of ₹1 with each moving average behind the safety switch." title="Growth of ₹1 with each moving average behind the safety switch."/>
+            <wp:docPr id="532542186" name="07_moving_averages.png" descr="Growth of ₹1 with each moving average behind the safety switch." title="Growth of ₹1 with each moving average behind the safety switch."/>
             <wp:cNvGraphicFramePr>
               <a:graphicFrameLocks xmlns:a="http://schemas.openxmlformats.org/drawingml/2006/main" noChangeAspect="1"/>
             </wp:cNvGraphicFramePr>
@@ -20928,7 +20928,7 @@
       <w:pPr>
         <w:pStyle w:val="Heading2"/>
       </w:pPr>
-      <w:bookmarkStart w:id="40" w:name="_Toc241269514"/>
+      <w:bookmarkStart w:id="40" w:name="_Toc241270441"/>
       <w:r>
         <w:t>Should the waiting money go into gold?</w:t>
       </w:r>
@@ -20953,7 +20953,7 @@
       <w:pPr>
         <w:pStyle w:val="Heading2"/>
       </w:pPr>
-      <w:bookmarkStart w:id="41" w:name="_Toc241269515"/>
+      <w:bookmarkStart w:id="41" w:name="_Toc241270442"/>
       <w:r>
         <w:t>Would a stop-loss help?</w:t>
       </w:r>
@@ -20979,7 +20979,7 @@
         <w:pStyle w:val="Heading1"/>
         <w:pageBreakBefore/>
       </w:pPr>
-      <w:bookmarkStart w:id="42" w:name="_Toc241269516"/>
+      <w:bookmarkStart w:id="42" w:name="_Toc241270443"/>
       <w:r>
         <w:t>9. Costs, tax and how much money it can handle</w:t>
       </w:r>
@@ -20989,7 +20989,7 @@
       <w:pPr>
         <w:pStyle w:val="Heading2"/>
       </w:pPr>
-      <w:bookmarkStart w:id="43" w:name="_Toc241269517"/>
+      <w:bookmarkStart w:id="43" w:name="_Toc241270444"/>
       <w:r>
         <w:t>Trading costs</w:t>
       </w:r>
@@ -21708,7 +21708,7 @@
       <w:pPr>
         <w:pStyle w:val="Heading2"/>
       </w:pPr>
-      <w:bookmarkStart w:id="44" w:name="_Toc241269518"/>
+      <w:bookmarkStart w:id="44" w:name="_Toc241270445"/>
       <w:r>
         <w:t>Tax</w:t>
       </w:r>
@@ -22006,7 +22006,7 @@
       <w:pPr>
         <w:pStyle w:val="Heading2"/>
       </w:pPr>
-      <w:bookmarkStart w:id="45" w:name="_Toc241269519"/>
+      <w:bookmarkStart w:id="45" w:name="_Toc241270446"/>
       <w:r>
         <w:t>How much money can it handle?</w:t>
       </w:r>
@@ -22634,7 +22634,7 @@
         <w:pStyle w:val="Heading1"/>
         <w:pageBreakBefore/>
       </w:pPr>
-      <w:bookmarkStart w:id="46" w:name="_Toc241269520"/>
+      <w:bookmarkStart w:id="46" w:name="_Toc241270447"/>
       <w:r>
         <w:t>10. What it feels like to hold</w:t>
       </w:r>
@@ -22652,7 +22652,7 @@
       <w:pPr>
         <w:pStyle w:val="Heading2"/>
       </w:pPr>
-      <w:bookmarkStart w:id="47" w:name="_Toc241269521"/>
+      <w:bookmarkStart w:id="47" w:name="_Toc241270448"/>
       <w:r>
         <w:t>You will spend most of your time below your last high</w:t>
       </w:r>
@@ -22680,7 +22680,7 @@
       <w:pPr>
         <w:pStyle w:val="Heading2"/>
       </w:pPr>
-      <w:bookmarkStart w:id="48" w:name="_Toc241269522"/>
+      <w:bookmarkStart w:id="48" w:name="_Toc241270449"/>
       <w:r>
         <w:t>You will be wrong half the time</w:t>
       </w:r>
@@ -22698,7 +22698,7 @@
       <w:pPr>
         <w:pStyle w:val="Heading2"/>
       </w:pPr>
-      <w:bookmarkStart w:id="49" w:name="_Toc241269523"/>
+      <w:bookmarkStart w:id="49" w:name="_Toc241270450"/>
       <w:r>
         <w:t>You will look foolish sometimes</w:t>
       </w:r>
@@ -22768,7 +22768,7 @@
       <w:pPr>
         <w:pStyle w:val="Heading2"/>
       </w:pPr>
-      <w:bookmarkStart w:id="50" w:name="_Toc241269524"/>
+      <w:bookmarkStart w:id="50" w:name="_Toc241270451"/>
       <w:r>
         <w:t>Eggs in one basket</w:t>
       </w:r>
@@ -23460,7 +23460,7 @@
         <w:pStyle w:val="Heading1"/>
         <w:pageBreakBefore/>
       </w:pPr>
-      <w:bookmarkStart w:id="51" w:name="_Toc241269525"/>
+      <w:bookmarkStart w:id="51" w:name="_Toc241270452"/>
       <w:r>
         <w:t>11. How to run it yourself</w:t>
       </w:r>
@@ -23470,7 +23470,7 @@
       <w:pPr>
         <w:pStyle w:val="Heading2"/>
       </w:pPr>
-      <w:bookmarkStart w:id="52" w:name="_Toc241269526"/>
+      <w:bookmarkStart w:id="52" w:name="_Toc241270453"/>
       <w:r>
         <w:t>What you need</w:t>
       </w:r>
@@ -23580,7 +23580,7 @@
       <w:pPr>
         <w:pStyle w:val="Heading2"/>
       </w:pPr>
-      <w:bookmarkStart w:id="53" w:name="_Toc241269527"/>
+      <w:bookmarkStart w:id="53" w:name="_Toc241270454"/>
       <w:r>
         <w:t>Every trading day (one minute)</w:t>
       </w:r>
@@ -23639,7 +23639,7 @@
       <w:pPr>
         <w:pStyle w:val="Heading2"/>
       </w:pPr>
-      <w:bookmarkStart w:id="54" w:name="_Toc241269528"/>
+      <w:bookmarkStart w:id="54" w:name="_Toc241270455"/>
       <w:r>
         <w:t>Every month-end (about an hour)</w:t>
       </w:r>
@@ -23789,7 +23789,7 @@
       <w:pPr>
         <w:pStyle w:val="Heading2"/>
       </w:pPr>
-      <w:bookmarkStart w:id="55" w:name="_Toc241269529"/>
+      <w:bookmarkStart w:id="55" w:name="_Toc241270456"/>
       <w:r>
         <w:t>A worked example: September 2026</w:t>
       </w:r>
@@ -23807,7 +23807,7 @@
       <w:pPr>
         <w:pStyle w:val="Heading2"/>
       </w:pPr>
-      <w:bookmarkStart w:id="56" w:name="_Toc241269530"/>
+      <w:bookmarkStart w:id="56" w:name="_Toc241270457"/>
       <w:r>
         <w:t>Practical tips</w:t>
       </w:r>
@@ -23918,7 +23918,7 @@
         <w:pStyle w:val="Heading1"/>
         <w:pageBreakBefore/>
       </w:pPr>
-      <w:bookmarkStart w:id="57" w:name="_Toc241269531"/>
+      <w:bookmarkStart w:id="57" w:name="_Toc241270458"/>
       <w:r>
         <w:t>12. Common mistakes, and questions people ask</w:t>
       </w:r>
@@ -23928,7 +23928,7 @@
       <w:pPr>
         <w:pStyle w:val="Heading2"/>
       </w:pPr>
-      <w:bookmarkStart w:id="58" w:name="_Toc241269532"/>
+      <w:bookmarkStart w:id="58" w:name="_Toc241270459"/>
       <w:r>
         <w:t>Mistakes to avoid</w:t>
       </w:r>
@@ -24501,7 +24501,7 @@
       <w:pPr>
         <w:pStyle w:val="Heading2"/>
       </w:pPr>
-      <w:bookmarkStart w:id="59" w:name="_Toc241269533"/>
+      <w:bookmarkStart w:id="59" w:name="_Toc241270460"/>
       <w:r>
         <w:t>Questions people ask</w:t>
       </w:r>
@@ -24624,7 +24624,7 @@
         <w:pStyle w:val="Heading1"/>
         <w:pageBreakBefore/>
       </w:pPr>
-      <w:bookmarkStart w:id="60" w:name="_Toc241269534"/>
+      <w:bookmarkStart w:id="60" w:name="_Toc241270461"/>
       <w:r>
         <w:t>13. Momentum with ETFs</w:t>
       </w:r>
@@ -24652,7 +24652,7 @@
       <w:pPr>
         <w:pStyle w:val="Heading2"/>
       </w:pPr>
-      <w:bookmarkStart w:id="61" w:name="_Toc241269535"/>
+      <w:bookmarkStart w:id="61" w:name="_Toc241270462"/>
       <w:r>
         <w:t>Why use ETFs?</w:t>
       </w:r>
@@ -24762,7 +24762,7 @@
       <w:pPr>
         <w:pStyle w:val="Heading2"/>
       </w:pPr>
-      <w:bookmarkStart w:id="62" w:name="_Toc241269536"/>
+      <w:bookmarkStart w:id="62" w:name="_Toc241270463"/>
       <w:r>
         <w:t>The ETFs tested</w:t>
       </w:r>
@@ -26408,7 +26408,7 @@
       <w:pPr>
         <w:pStyle w:val="Heading2"/>
       </w:pPr>
-      <w:bookmarkStart w:id="63" w:name="_Toc241269537"/>
+      <w:bookmarkStart w:id="63" w:name="_Toc241270464"/>
       <w:r>
         <w:t>The rules</w:t>
       </w:r>
@@ -26901,7 +26901,7 @@
                 <w:sz w:val="19"/>
                 <w:szCs w:val="19"/>
               </w:rPr>
-              <w:t>Out of the top 7, or fails a filter</w:t>
+              <w:t>Out of the top 9, or fails a filter</w:t>
             </w:r>
           </w:p>
         </w:tc>
@@ -27183,7 +27183,7 @@
       <w:pPr>
         <w:pStyle w:val="Heading2"/>
       </w:pPr>
-      <w:bookmarkStart w:id="64" w:name="_Toc241269538"/>
+      <w:bookmarkStart w:id="64" w:name="_Toc241270465"/>
       <w:r>
         <w:t>The results</w:t>
       </w:r>
@@ -27510,7 +27510,7 @@
                 <w:sz w:val="19"/>
                 <w:szCs w:val="19"/>
               </w:rPr>
-              <w:t>17.7%</w:t>
+              <w:t>18.6%</w:t>
             </w:r>
           </w:p>
         </w:tc>
@@ -27542,7 +27542,7 @@
                 <w:sz w:val="19"/>
                 <w:szCs w:val="19"/>
               </w:rPr>
-              <w:t>-22.2%</w:t>
+              <w:t>-21.5%</w:t>
             </w:r>
           </w:p>
         </w:tc>
@@ -27574,7 +27574,7 @@
                 <w:sz w:val="19"/>
                 <w:szCs w:val="19"/>
               </w:rPr>
-              <w:t>12.2%</w:t>
+              <w:t>12.1%</w:t>
             </w:r>
           </w:p>
         </w:tc>
@@ -27606,7 +27606,7 @@
                 <w:sz w:val="19"/>
                 <w:szCs w:val="19"/>
               </w:rPr>
-              <w:t>0.89</w:t>
+              <w:t>0.96</w:t>
             </w:r>
           </w:p>
         </w:tc>
@@ -27647,7 +27647,7 @@
                 <w:sz w:val="19"/>
                 <w:szCs w:val="19"/>
               </w:rPr>
-              <w:t>4.27 lakh</w:t>
+              <w:t>4.56 lakh</w:t>
             </w:r>
           </w:p>
         </w:tc>
@@ -28047,10 +28047,10 @@
           <w:noProof/>
         </w:rPr>
         <w:drawing>
-          <wp:inline distT="0" distB="0" distL="0" distR="0" wp14:anchorId="03B88FE7" wp14:editId="5A753867">
+          <wp:inline distT="0" distB="0" distL="0" distR="0" wp14:anchorId="225422F9" wp14:editId="10CE6C06">
             <wp:extent cx="5715000" cy="2809875"/>
             <wp:effectExtent l="0" t="0" r="0" b="0"/>
-            <wp:docPr id="1059474637" name="09_etf_growth.png" descr="Growth of ₹1 with the ETF rotation, against simply holding NIFTYBEES or GOLDBEES." title="Growth of ₹1 with the ETF rotation, against simply holding NIFTYBEES or GOLDBEES."/>
+            <wp:docPr id="2054595584" name="09_etf_growth.png" descr="Growth of ₹1 with the ETF rotation, against simply holding NIFTYBEES or GOLDBEES." title="Growth of ₹1 with the ETF rotation, against simply holding NIFTYBEES or GOLDBEES."/>
             <wp:cNvGraphicFramePr>
               <a:graphicFrameLocks xmlns:a="http://schemas.openxmlformats.org/drawingml/2006/main" noChangeAspect="1"/>
             </wp:cNvGraphicFramePr>
@@ -28122,7 +28122,7 @@
           <w:b/>
           <w:bCs/>
         </w:rPr>
-        <w:t>17.7% a year</w:t>
+        <w:t>18.6% a year</w:t>
       </w:r>
       <w:r>
         <w:t xml:space="preserve"> with a worst fall of only </w:t>
@@ -28132,10 +28132,10 @@
           <w:b/>
           <w:bCs/>
         </w:rPr>
-        <w:t>-22.2%</w:t>
-      </w:r>
-      <w:r>
-        <w:t xml:space="preserve"> and volatility of 12.2%, lower than even the Nifty's. NIFTYBEES earned 10.7% with a worst fall of -36.3% (the March 2020 crash). Simply holding </w:t>
+        <w:t>-21.5%</w:t>
+      </w:r>
+      <w:r>
+        <w:t xml:space="preserve"> and volatility of 12.1%, lower than even the Nifty's. NIFTYBEES earned 10.7% with a worst fall of -36.3% (the March 2020 crash). Simply holding </w:t>
       </w:r>
       <w:r>
         <w:rPr>
@@ -28153,14 +28153,14 @@
         <w:spacing w:after="140" w:line="300" w:lineRule="auto"/>
       </w:pPr>
       <w:r>
-        <w:t xml:space="preserve">Its early years were quiet, because only a few ETFs existed and money often sat in cash (32% on average over the whole period). Since all the ETFs were trading (Aug 2024), it earned </w:t>
+        <w:t xml:space="preserve">Its early years were quiet, because only a few ETFs existed and money often sat in cash (33% on average over the whole period). Since all the ETFs were trading (Aug 2024), it earned </w:t>
       </w:r>
       <w:r>
         <w:rPr>
           <w:b/>
           <w:bCs/>
         </w:rPr>
-        <w:t>21.0% a year</w:t>
+        <w:t>24.7% a year</w:t>
       </w:r>
       <w:r>
         <w:t xml:space="preserve"> while NIFTYBEES earned -2.6%.</w:t>
@@ -29282,7 +29282,7 @@
                 <w:sz w:val="19"/>
                 <w:szCs w:val="19"/>
               </w:rPr>
-              <w:t>+16.6%</w:t>
+              <w:t>+21.0%</w:t>
             </w:r>
           </w:p>
         </w:tc>
@@ -29406,7 +29406,7 @@
                 <w:sz w:val="19"/>
                 <w:szCs w:val="19"/>
               </w:rPr>
-              <w:t>+50.4%</w:t>
+              <w:t>+49.6%</w:t>
             </w:r>
           </w:p>
         </w:tc>
@@ -29530,7 +29530,7 @@
                 <w:sz w:val="19"/>
                 <w:szCs w:val="19"/>
               </w:rPr>
-              <w:t>+10.1%</w:t>
+              <w:t>+13.9%</w:t>
             </w:r>
           </w:p>
         </w:tc>
@@ -29603,7 +29603,7 @@
       <w:pPr>
         <w:pStyle w:val="Heading2"/>
       </w:pPr>
-      <w:bookmarkStart w:id="65" w:name="_Toc241269539"/>
+      <w:bookmarkStart w:id="65" w:name="_Toc241270466"/>
       <w:r>
         <w:t>What it held</w:t>
       </w:r>
@@ -29620,10 +29620,10 @@
           <w:noProof/>
         </w:rPr>
         <w:drawing>
-          <wp:inline distT="0" distB="0" distL="0" distR="0" wp14:anchorId="5E01BD0E" wp14:editId="03BEA2AC">
+          <wp:inline distT="0" distB="0" distL="0" distR="0" wp14:anchorId="5A12D32E" wp14:editId="1F3C83F9">
             <wp:extent cx="5715000" cy="2990850"/>
             <wp:effectExtent l="0" t="0" r="0" b="0"/>
-            <wp:docPr id="437206782" name="10_etf_held.png" descr="Months each ETF spent in the portfolio, out of 107." title="Months each ETF spent in the portfolio, out of 107."/>
+            <wp:docPr id="1066812062" name="10_etf_held.png" descr="Months each ETF spent in the portfolio, out of 107." title="Months each ETF spent in the portfolio, out of 107."/>
             <wp:cNvGraphicFramePr>
               <a:graphicFrameLocks xmlns:a="http://schemas.openxmlformats.org/drawingml/2006/main" noChangeAspect="1"/>
             </wp:cNvGraphicFramePr>
@@ -29688,7 +29688,7 @@
         <w:spacing w:after="140" w:line="300" w:lineRule="auto"/>
       </w:pPr>
       <w:r>
-        <w:t>Gold and the Nifty were the backbone, joined by PSU banks and CPSE companies during their long rally, and by silver, bonds, pharma and metals more recently. HEALTHY, INFRAIETF, MODEFENCE, MOREALTY were never picked. At the last month-end, for example: HEALTHY: trades under ₹1 crore a day; INFRAIETF: below its 233-day average; MODEFENCE: ranked below the top 5; MOREALTY: ranked below the top 5.</w:t>
+        <w:t>Gold and the Nifty were the backbone, joined by PSU banks and CPSE companies during their long rally, and by silver, bonds, pharma and metals more recently. AUTOBEES, FMCGIETF, HEALTHY, INFRAIETF, MODEFENCE, MOREALTY were never picked. At the last month-end, for example: AUTOBEES: ranked below the top 5; FMCGIETF: 30% below its all-time high; HEALTHY: trades under ₹1 crore a day; INFRAIETF: below its 233-day average; MODEFENCE: ranked below the top 5; MOREALTY: ranked below the top 5.</w:t>
       </w:r>
     </w:p>
     <w:p>
@@ -29703,7 +29703,7 @@
           <w:b/>
           <w:bCs/>
         </w:rPr>
-        <w:t>26 completed trades</w:t>
+        <w:t>21 completed trades</w:t>
       </w:r>
       <w:r>
         <w:t xml:space="preserve">, and </w:t>
@@ -29713,10 +29713,10 @@
           <w:b/>
           <w:bCs/>
         </w:rPr>
-        <w:t>65% made money</w:t>
-      </w:r>
-      <w:r>
-        <w:t>. The average winner gained +45%, the average loser lost just -6%, and a typical ETF was held for about 10 months.</w:t>
+        <w:t>67% made money</w:t>
+      </w:r>
+      <w:r>
+        <w:t>. The average winner gained +52%, the average loser lost just -5%, and a typical ETF was held for about 11 months.</w:t>
       </w:r>
     </w:p>
     <w:p>
@@ -30244,7 +30244,7 @@
                 <w:sz w:val="19"/>
                 <w:szCs w:val="19"/>
               </w:rPr>
-              <w:t>Sep 2024</w:t>
+              <w:t>Oct 2024</w:t>
             </w:r>
           </w:p>
         </w:tc>
@@ -30273,7 +30273,7 @@
                 <w:sz w:val="19"/>
                 <w:szCs w:val="19"/>
               </w:rPr>
-              <w:t>+96%</w:t>
+              <w:t>+95%</w:t>
             </w:r>
           </w:p>
         </w:tc>
@@ -30536,7 +30536,7 @@
       <w:pPr>
         <w:pStyle w:val="Heading2"/>
       </w:pPr>
-      <w:bookmarkStart w:id="66" w:name="_Toc241269540"/>
+      <w:bookmarkStart w:id="66" w:name="_Toc241270467"/>
       <w:r>
         <w:t>Does it depend on the settings?</w:t>
       </w:r>
@@ -30790,7 +30790,7 @@
                 <w:sz w:val="19"/>
                 <w:szCs w:val="19"/>
               </w:rPr>
-              <w:t>21.1%</w:t>
+              <w:t>19.9%</w:t>
             </w:r>
           </w:p>
         </w:tc>
@@ -30819,7 +30819,7 @@
                 <w:sz w:val="19"/>
                 <w:szCs w:val="19"/>
               </w:rPr>
-              <w:t>-32.0%</w:t>
+              <w:t>-16.7%</w:t>
             </w:r>
           </w:p>
         </w:tc>
@@ -30848,7 +30848,7 @@
                 <w:sz w:val="19"/>
                 <w:szCs w:val="19"/>
               </w:rPr>
-              <w:t>0.84</w:t>
+              <w:t>0.92</w:t>
             </w:r>
           </w:p>
         </w:tc>
@@ -30914,7 +30914,7 @@
                 <w:sz w:val="19"/>
                 <w:szCs w:val="19"/>
               </w:rPr>
-              <w:t>22.4%</w:t>
+              <w:t>20.8%</w:t>
             </w:r>
           </w:p>
         </w:tc>
@@ -30943,7 +30943,7 @@
                 <w:sz w:val="19"/>
                 <w:szCs w:val="19"/>
               </w:rPr>
-              <w:t>-30.6%</w:t>
+              <w:t>-27.5%</w:t>
             </w:r>
           </w:p>
         </w:tc>
@@ -30972,7 +30972,7 @@
                 <w:sz w:val="19"/>
                 <w:szCs w:val="19"/>
               </w:rPr>
-              <w:t>0.96</w:t>
+              <w:t>0.87</w:t>
             </w:r>
           </w:p>
         </w:tc>
@@ -31044,7 +31044,7 @@
                 <w:sz w:val="19"/>
                 <w:szCs w:val="19"/>
               </w:rPr>
-              <w:t>17.7%</w:t>
+              <w:t>18.6%</w:t>
             </w:r>
           </w:p>
         </w:tc>
@@ -31076,7 +31076,7 @@
                 <w:sz w:val="19"/>
                 <w:szCs w:val="19"/>
               </w:rPr>
-              <w:t>-22.2%</w:t>
+              <w:t>-21.5%</w:t>
             </w:r>
           </w:p>
         </w:tc>
@@ -31108,7 +31108,7 @@
                 <w:sz w:val="19"/>
                 <w:szCs w:val="19"/>
               </w:rPr>
-              <w:t>0.89</w:t>
+              <w:t>0.96</w:t>
             </w:r>
           </w:p>
         </w:tc>
@@ -31174,7 +31174,7 @@
                 <w:sz w:val="19"/>
                 <w:szCs w:val="19"/>
               </w:rPr>
-              <w:t>14.9%</w:t>
+              <w:t>14.5%</w:t>
             </w:r>
           </w:p>
         </w:tc>
@@ -31203,7 +31203,7 @@
                 <w:sz w:val="19"/>
                 <w:szCs w:val="19"/>
               </w:rPr>
-              <w:t>-19.4%</w:t>
+              <w:t>-20.2%</w:t>
             </w:r>
           </w:p>
         </w:tc>
@@ -31232,7 +31232,7 @@
                 <w:sz w:val="19"/>
                 <w:szCs w:val="19"/>
               </w:rPr>
-              <w:t>0.81</w:t>
+              <w:t>0.78</w:t>
             </w:r>
           </w:p>
         </w:tc>
@@ -31298,7 +31298,7 @@
                 <w:sz w:val="19"/>
                 <w:szCs w:val="19"/>
               </w:rPr>
-              <w:t>14.4%</w:t>
+              <w:t>11.9%</w:t>
             </w:r>
           </w:p>
         </w:tc>
@@ -31327,7 +31327,7 @@
                 <w:sz w:val="19"/>
                 <w:szCs w:val="19"/>
               </w:rPr>
-              <w:t>-26.8%</w:t>
+              <w:t>-24.3%</w:t>
             </w:r>
           </w:p>
         </w:tc>
@@ -31356,7 +31356,7 @@
                 <w:sz w:val="19"/>
                 <w:szCs w:val="19"/>
               </w:rPr>
-              <w:t>0.58</w:t>
+              <w:t>0.43</w:t>
             </w:r>
           </w:p>
         </w:tc>
@@ -31422,7 +31422,7 @@
                 <w:sz w:val="19"/>
                 <w:szCs w:val="19"/>
               </w:rPr>
-              <w:t>15.8%</w:t>
+              <w:t>14.6%</w:t>
             </w:r>
           </w:p>
         </w:tc>
@@ -31451,7 +31451,7 @@
                 <w:sz w:val="19"/>
                 <w:szCs w:val="19"/>
               </w:rPr>
-              <w:t>-22.2%</w:t>
+              <w:t>-16.1%</w:t>
             </w:r>
           </w:p>
         </w:tc>
@@ -31480,7 +31480,7 @@
                 <w:sz w:val="19"/>
                 <w:szCs w:val="19"/>
               </w:rPr>
-              <w:t>0.73</w:t>
+              <w:t>0.72</w:t>
             </w:r>
           </w:p>
         </w:tc>
@@ -31546,7 +31546,7 @@
                 <w:sz w:val="19"/>
                 <w:szCs w:val="19"/>
               </w:rPr>
-              <w:t>15.7%</w:t>
+              <w:t>16.4%</w:t>
             </w:r>
           </w:p>
         </w:tc>
@@ -31575,7 +31575,7 @@
                 <w:sz w:val="19"/>
                 <w:szCs w:val="19"/>
               </w:rPr>
-              <w:t>-20.9%</w:t>
+              <w:t>-21.3%</w:t>
             </w:r>
           </w:p>
         </w:tc>
@@ -31604,7 +31604,7 @@
                 <w:sz w:val="19"/>
                 <w:szCs w:val="19"/>
               </w:rPr>
-              <w:t>0.83</w:t>
+              <w:t>0.87</w:t>
             </w:r>
           </w:p>
         </w:tc>
@@ -31629,10 +31629,10 @@
           <w:b/>
           <w:bCs/>
         </w:rPr>
-        <w:t>Fewer ETFs, bigger swings.</w:t>
-      </w:r>
-      <w:r>
-        <w:t xml:space="preserve"> Holding 2 or 3 earned more but fell harder; holding 7 was smoother but earned less. Five is a sensible middle.</w:t>
+        <w:t>Five is a sensible middle.</w:t>
+      </w:r>
+      <w:r>
+        <w:t xml:space="preserve"> Holding 2 or 3 earned a little more but gave a less steady ride; holding 7 earned clearly less.</w:t>
       </w:r>
     </w:p>
     <w:p>
@@ -31652,7 +31652,7 @@
         <w:t>The filters matter.</w:t>
       </w:r>
       <w:r>
-        <w:t xml:space="preserve"> Without them the return dropped and the falls deepened. The trend filter did most of the work.</w:t>
+        <w:t xml:space="preserve"> Without them the return dropped sharply. The trend filter did the most work, followed by the turnover filter.</w:t>
       </w:r>
     </w:p>
     <w:p>
@@ -31699,7 +31699,7 @@
       <w:pPr>
         <w:pStyle w:val="Heading2"/>
       </w:pPr>
-      <w:bookmarkStart w:id="67" w:name="_Toc241269541"/>
+      <w:bookmarkStart w:id="67" w:name="_Toc241270468"/>
       <w:r>
         <w:t>Stocks or ETFs?</w:t>
       </w:r>
@@ -32014,7 +32014,7 @@
                 <w:sz w:val="19"/>
                 <w:szCs w:val="19"/>
               </w:rPr>
-              <w:t>17.7%</w:t>
+              <w:t>18.6%</w:t>
             </w:r>
           </w:p>
         </w:tc>
@@ -32103,7 +32103,7 @@
                 <w:sz w:val="19"/>
                 <w:szCs w:val="19"/>
               </w:rPr>
-              <w:t>-22.2%</w:t>
+              <w:t>-21.5%</w:t>
             </w:r>
           </w:p>
         </w:tc>
@@ -32192,7 +32192,7 @@
                 <w:sz w:val="19"/>
                 <w:szCs w:val="19"/>
               </w:rPr>
-              <w:t>12.2%</w:t>
+              <w:t>12.1%</w:t>
             </w:r>
           </w:p>
         </w:tc>
@@ -32281,7 +32281,7 @@
                 <w:sz w:val="19"/>
                 <w:szCs w:val="19"/>
               </w:rPr>
-              <w:t>0.89</w:t>
+              <w:t>0.96</w:t>
             </w:r>
           </w:p>
         </w:tc>
@@ -32370,7 +32370,7 @@
                 <w:sz w:val="19"/>
                 <w:szCs w:val="19"/>
               </w:rPr>
-              <w:t>26</w:t>
+              <w:t>21</w:t>
             </w:r>
           </w:p>
         </w:tc>
@@ -32593,7 +32593,7 @@
         <w:pStyle w:val="Heading1"/>
         <w:pageBreakBefore/>
       </w:pPr>
-      <w:bookmarkStart w:id="68" w:name="_Toc241269542"/>
+      <w:bookmarkStart w:id="68" w:name="_Toc241270469"/>
       <w:r>
         <w:t>Appendix A: Glossary</w:t>
       </w:r>
@@ -33458,7 +33458,7 @@
         <w:pStyle w:val="Heading1"/>
         <w:pageBreakBefore/>
       </w:pPr>
-      <w:bookmarkStart w:id="69" w:name="_Toc241269543"/>
+      <w:bookmarkStart w:id="69" w:name="_Toc241270470"/>
       <w:r>
         <w:t>Appendix B: Data and method</w:t>
       </w:r>
@@ -33649,7 +33649,7 @@
         <w:pStyle w:val="Heading1"/>
         <w:pageBreakBefore/>
       </w:pPr>
-      <w:bookmarkStart w:id="70" w:name="_Toc241269544"/>
+      <w:bookmarkStart w:id="70" w:name="_Toc241270471"/>
       <w:r>
         <w:t>Appendix C: Further reading</w:t>
       </w:r>
@@ -34021,10 +34021,10 @@
 <file path=word/numbering.xml><?xml version="1.0" encoding="utf-8"?>
 <w:numbering xmlns:wpc="http://schemas.microsoft.com/office/word/2010/wordprocessingCanvas" xmlns:cx="http://schemas.microsoft.com/office/drawing/2014/chartex" xmlns:cx1="http://schemas.microsoft.com/office/drawing/2015/9/8/chartex" xmlns:cx2="http://schemas.microsoft.com/office/drawing/2015/10/21/chartex" xmlns:cx3="http://schemas.microsoft.com/office/drawing/2016/5/9/chartex" xmlns:cx4="http://schemas.microsoft.com/office/drawing/2016/5/10/chartex" xmlns:cx5="http://schemas.microsoft.com/office/drawing/2016/5/11/chartex" xmlns:cx6="http://schemas.microsoft.com/office/drawing/2016/5/12/chartex" xmlns:cx7="http://schemas.microsoft.com/office/drawing/2016/5/13/chartex" xmlns:cx8="http://schemas.microsoft.com/office/drawing/2016/5/14/chartex" xmlns:mc="http://schemas.openxmlformats.org/markup-compatibility/2006" xmlns:aink="http://schemas.microsoft.com/office/drawing/2016/ink" xmlns:am3d="http://schemas.microsoft.com/office/drawing/2017/model3d" xmlns:o="urn:schemas-microsoft-com:office:office" xmlns:oel="http://schemas.microsoft.com/office/2019/extlst" xmlns:r="http://schemas.openxmlformats.org/officeDocument/2006/relationships" xmlns:m="http://schemas.openxmlformats.org/officeDocument/2006/math" xmlns:v="urn:schemas-microsoft-com:vml" xmlns:wp14="http://schemas.microsoft.com/office/word/2010/wordprocessingDrawing" xmlns:wp="http://schemas.openxmlformats.org/drawingml/2006/wordprocessingDrawing" xmlns:w10="urn:schemas-microsoft-com:office:word" xmlns:w="http://schemas.openxmlformats.org/wordprocessingml/2006/main" xmlns:w14="http://schemas.microsoft.com/office/word/2010/wordml" xmlns:w15="http://schemas.microsoft.com/office/word/2012/wordml" xmlns:w16cex="http://schemas.microsoft.com/office/word/2018/wordml/cex" xmlns:w16cid="http://schemas.microsoft.com/office/word/2016/wordml/cid" xmlns:w16="http://schemas.microsoft.com/office/word/2018/wordml" xmlns:w16du="http://schemas.microsoft.com/office/word/2023/wordml/word16du" xmlns:w16sdtdh="http://schemas.microsoft.com/office/word/2020/wordml/sdtdatahash" xmlns:w16sdtfl="http://schemas.microsoft.com/office/word/2024/wordml/sdtformatlock" xmlns:w16se="http://schemas.microsoft.com/office/word/2015/wordml/symex" xmlns:wpg="http://schemas.microsoft.com/office/word/2010/wordprocessingGroup" xmlns:wpi="http://schemas.microsoft.com/office/word/2010/wordprocessingInk" xmlns:wne="http://schemas.microsoft.com/office/word/2006/wordml" xmlns:wps="http://schemas.microsoft.com/office/word/2010/wordprocessingShape" mc:Ignorable="w14 w15 w16se w16cid w16 w16cex w16sdtdh w16sdtfl w16du wp14">
   <w:abstractNum w:abstractNumId="0" w15:restartNumberingAfterBreak="0">
-    <w:nsid w:val="21271EB7"/>
+    <w:nsid w:val="086C3C19"/>
     <w:multiLevelType w:val="hybridMultilevel"/>
-    <w:tmpl w:val="F6EA156C"/>
-    <w:lvl w:ilvl="0" w:tplc="2F9CD21E">
+    <w:tmpl w:val="AD1A6668"/>
+    <w:lvl w:ilvl="0" w:tplc="10B410AA">
       <w:start w:val="1"/>
       <w:numFmt w:val="decimal"/>
       <w:lvlText w:val="%1."/>
@@ -34033,52 +34033,52 @@
         <w:ind w:left="540" w:hanging="360"/>
       </w:pPr>
     </w:lvl>
-    <w:lvl w:ilvl="1" w:tplc="73C24E98">
+    <w:lvl w:ilvl="1" w:tplc="CFD24724">
       <w:numFmt w:val="decimal"/>
       <w:lvlText w:val=""/>
       <w:lvlJc w:val="left"/>
     </w:lvl>
-    <w:lvl w:ilvl="2" w:tplc="AF027954">
+    <w:lvl w:ilvl="2" w:tplc="97089C4A">
       <w:numFmt w:val="decimal"/>
       <w:lvlText w:val=""/>
       <w:lvlJc w:val="left"/>
     </w:lvl>
-    <w:lvl w:ilvl="3" w:tplc="02549A3C">
+    <w:lvl w:ilvl="3" w:tplc="73F86856">
       <w:numFmt w:val="decimal"/>
       <w:lvlText w:val=""/>
       <w:lvlJc w:val="left"/>
     </w:lvl>
-    <w:lvl w:ilvl="4" w:tplc="85F8DF68">
+    <w:lvl w:ilvl="4" w:tplc="26B659D2">
       <w:numFmt w:val="decimal"/>
       <w:lvlText w:val=""/>
       <w:lvlJc w:val="left"/>
     </w:lvl>
-    <w:lvl w:ilvl="5" w:tplc="32E4CC32">
+    <w:lvl w:ilvl="5" w:tplc="652826E8">
       <w:numFmt w:val="decimal"/>
       <w:lvlText w:val=""/>
       <w:lvlJc w:val="left"/>
     </w:lvl>
-    <w:lvl w:ilvl="6" w:tplc="2118E51C">
+    <w:lvl w:ilvl="6" w:tplc="0E82E1C0">
       <w:numFmt w:val="decimal"/>
       <w:lvlText w:val=""/>
       <w:lvlJc w:val="left"/>
     </w:lvl>
-    <w:lvl w:ilvl="7" w:tplc="E7A06C0A">
+    <w:lvl w:ilvl="7" w:tplc="0DF82350">
       <w:numFmt w:val="decimal"/>
       <w:lvlText w:val=""/>
       <w:lvlJc w:val="left"/>
     </w:lvl>
-    <w:lvl w:ilvl="8" w:tplc="2496FFF0">
+    <w:lvl w:ilvl="8" w:tplc="3A0A201E">
       <w:numFmt w:val="decimal"/>
       <w:lvlText w:val=""/>
       <w:lvlJc w:val="left"/>
     </w:lvl>
   </w:abstractNum>
   <w:abstractNum w:abstractNumId="1" w15:restartNumberingAfterBreak="0">
-    <w:nsid w:val="302C3278"/>
+    <w:nsid w:val="6A1A4453"/>
     <w:multiLevelType w:val="hybridMultilevel"/>
-    <w:tmpl w:val="60421788"/>
-    <w:lvl w:ilvl="0" w:tplc="0002AD8A">
+    <w:tmpl w:val="C1C2C5B8"/>
+    <w:lvl w:ilvl="0" w:tplc="A7805440">
       <w:start w:val="1"/>
       <w:numFmt w:val="bullet"/>
       <w:lvlText w:val="●"/>
@@ -34087,7 +34087,7 @@
         <w:ind w:left="720" w:hanging="360"/>
       </w:pPr>
     </w:lvl>
-    <w:lvl w:ilvl="1" w:tplc="0A7EFBBA">
+    <w:lvl w:ilvl="1" w:tplc="6D34C372">
       <w:start w:val="1"/>
       <w:numFmt w:val="bullet"/>
       <w:lvlText w:val="○"/>
@@ -34096,7 +34096,7 @@
         <w:ind w:left="1440" w:hanging="360"/>
       </w:pPr>
     </w:lvl>
-    <w:lvl w:ilvl="2" w:tplc="B35C6CCE">
+    <w:lvl w:ilvl="2" w:tplc="961EA68A">
       <w:start w:val="1"/>
       <w:numFmt w:val="bullet"/>
       <w:lvlText w:val="■"/>
@@ -34105,7 +34105,7 @@
         <w:ind w:left="2160" w:hanging="360"/>
       </w:pPr>
     </w:lvl>
-    <w:lvl w:ilvl="3" w:tplc="A9F81BD4">
+    <w:lvl w:ilvl="3" w:tplc="8F2299EC">
       <w:start w:val="1"/>
       <w:numFmt w:val="bullet"/>
       <w:lvlText w:val="●"/>
@@ -34114,7 +34114,7 @@
         <w:ind w:left="2880" w:hanging="360"/>
       </w:pPr>
     </w:lvl>
-    <w:lvl w:ilvl="4" w:tplc="1E3AD958">
+    <w:lvl w:ilvl="4" w:tplc="8D824E3A">
       <w:start w:val="1"/>
       <w:numFmt w:val="bullet"/>
       <w:lvlText w:val="○"/>
@@ -34123,7 +34123,7 @@
         <w:ind w:left="3600" w:hanging="360"/>
       </w:pPr>
     </w:lvl>
-    <w:lvl w:ilvl="5" w:tplc="7FFE9FF8">
+    <w:lvl w:ilvl="5" w:tplc="5EECDA8C">
       <w:start w:val="1"/>
       <w:numFmt w:val="bullet"/>
       <w:lvlText w:val="■"/>
@@ -34132,7 +34132,7 @@
         <w:ind w:left="4320" w:hanging="360"/>
       </w:pPr>
     </w:lvl>
-    <w:lvl w:ilvl="6" w:tplc="72220B72">
+    <w:lvl w:ilvl="6" w:tplc="DBF29116">
       <w:start w:val="1"/>
       <w:numFmt w:val="bullet"/>
       <w:lvlText w:val="●"/>
@@ -34141,7 +34141,7 @@
         <w:ind w:left="5040" w:hanging="360"/>
       </w:pPr>
     </w:lvl>
-    <w:lvl w:ilvl="7" w:tplc="6A4A1404">
+    <w:lvl w:ilvl="7" w:tplc="A5206970">
       <w:start w:val="1"/>
       <w:numFmt w:val="bullet"/>
       <w:lvlText w:val="●"/>
@@ -34150,7 +34150,7 @@
         <w:ind w:left="5760" w:hanging="360"/>
       </w:pPr>
     </w:lvl>
-    <w:lvl w:ilvl="8" w:tplc="2B7EC4A8">
+    <w:lvl w:ilvl="8" w:tplc="8BBE8662">
       <w:start w:val="1"/>
       <w:numFmt w:val="bullet"/>
       <w:lvlText w:val="●"/>
@@ -34161,10 +34161,10 @@
     </w:lvl>
   </w:abstractNum>
   <w:abstractNum w:abstractNumId="2" w15:restartNumberingAfterBreak="0">
-    <w:nsid w:val="47750626"/>
+    <w:nsid w:val="78540735"/>
     <w:multiLevelType w:val="hybridMultilevel"/>
-    <w:tmpl w:val="196CCAB6"/>
-    <w:lvl w:ilvl="0" w:tplc="36D6124E">
+    <w:tmpl w:val="6C2408E8"/>
+    <w:lvl w:ilvl="0" w:tplc="E69A5922">
       <w:start w:val="1"/>
       <w:numFmt w:val="bullet"/>
       <w:lvlText w:val="•"/>
@@ -34173,72 +34173,72 @@
         <w:ind w:left="540" w:hanging="300"/>
       </w:pPr>
     </w:lvl>
-    <w:lvl w:ilvl="1" w:tplc="855CB0A0">
+    <w:lvl w:ilvl="1" w:tplc="EA24FF24">
       <w:numFmt w:val="decimal"/>
       <w:lvlText w:val=""/>
       <w:lvlJc w:val="left"/>
     </w:lvl>
-    <w:lvl w:ilvl="2" w:tplc="9BC67366">
+    <w:lvl w:ilvl="2" w:tplc="B930F9D2">
       <w:numFmt w:val="decimal"/>
       <w:lvlText w:val=""/>
       <w:lvlJc w:val="left"/>
     </w:lvl>
-    <w:lvl w:ilvl="3" w:tplc="AE186074">
+    <w:lvl w:ilvl="3" w:tplc="80DC046A">
       <w:numFmt w:val="decimal"/>
       <w:lvlText w:val=""/>
       <w:lvlJc w:val="left"/>
     </w:lvl>
-    <w:lvl w:ilvl="4" w:tplc="B47200CA">
+    <w:lvl w:ilvl="4" w:tplc="B1F80A7E">
       <w:numFmt w:val="decimal"/>
       <w:lvlText w:val=""/>
       <w:lvlJc w:val="left"/>
     </w:lvl>
-    <w:lvl w:ilvl="5" w:tplc="BFBADC46">
+    <w:lvl w:ilvl="5" w:tplc="012E9F22">
       <w:numFmt w:val="decimal"/>
       <w:lvlText w:val=""/>
       <w:lvlJc w:val="left"/>
     </w:lvl>
-    <w:lvl w:ilvl="6" w:tplc="F9E8DC72">
+    <w:lvl w:ilvl="6" w:tplc="63762582">
       <w:numFmt w:val="decimal"/>
       <w:lvlText w:val=""/>
       <w:lvlJc w:val="left"/>
     </w:lvl>
-    <w:lvl w:ilvl="7" w:tplc="82045988">
+    <w:lvl w:ilvl="7" w:tplc="47306B4A">
       <w:numFmt w:val="decimal"/>
       <w:lvlText w:val=""/>
       <w:lvlJc w:val="left"/>
     </w:lvl>
-    <w:lvl w:ilvl="8" w:tplc="4A4EEDEE">
+    <w:lvl w:ilvl="8" w:tplc="4FAE3078">
       <w:numFmt w:val="decimal"/>
       <w:lvlText w:val=""/>
       <w:lvlJc w:val="left"/>
     </w:lvl>
   </w:abstractNum>
-  <w:num w:numId="1" w16cid:durableId="1921869776">
+  <w:num w:numId="1" w16cid:durableId="1360816832">
     <w:abstractNumId w:val="1"/>
     <w:lvlOverride w:ilvl="0">
       <w:startOverride w:val="1"/>
     </w:lvlOverride>
   </w:num>
-  <w:num w:numId="2" w16cid:durableId="512958053">
+  <w:num w:numId="2" w16cid:durableId="1084033933">
     <w:abstractNumId w:val="2"/>
     <w:lvlOverride w:ilvl="0">
       <w:startOverride w:val="1"/>
     </w:lvlOverride>
   </w:num>
-  <w:num w:numId="3" w16cid:durableId="1186141333">
+  <w:num w:numId="3" w16cid:durableId="1174027390">
     <w:abstractNumId w:val="0"/>
     <w:lvlOverride w:ilvl="0">
       <w:startOverride w:val="1"/>
     </w:lvlOverride>
   </w:num>
-  <w:num w:numId="4" w16cid:durableId="362174418">
+  <w:num w:numId="4" w16cid:durableId="443888042">
     <w:abstractNumId w:val="0"/>
     <w:lvlOverride w:ilvl="0">
       <w:startOverride w:val="1"/>
     </w:lvlOverride>
   </w:num>
-  <w:num w:numId="5" w16cid:durableId="828179062">
+  <w:num w:numId="5" w16cid:durableId="237398971">
     <w:abstractNumId w:val="0"/>
     <w:lvlOverride w:ilvl="0">
       <w:startOverride w:val="1"/>
@@ -34862,7 +34862,7 @@
     <w:autoRedefine/>
     <w:uiPriority w:val="39"/>
     <w:unhideWhenUsed/>
-    <w:rsid w:val="006277EE"/>
+    <w:rsid w:val="009633A2"/>
     <w:pPr>
       <w:spacing w:after="100"/>
     </w:pPr>
@@ -34874,7 +34874,7 @@
     <w:autoRedefine/>
     <w:uiPriority w:val="39"/>
     <w:unhideWhenUsed/>
-    <w:rsid w:val="006277EE"/>
+    <w:rsid w:val="009633A2"/>
     <w:pPr>
       <w:spacing w:after="100"/>
       <w:ind w:left="220"/>

</xml_diff>